<commit_message>
docs: purge obsolete 1.20 weighted threshold and establish strict unanimous 3/3 consensus across all specs and AGENTS.md
</commit_message>
<xml_diff>
--- a/TECHNICAL_SPECIFICATION_2_STAGE_QUANT_FUNNEL_V2.docx
+++ b/TECHNICAL_SPECIFICATION_2_STAGE_QUANT_FUNNEL_V2.docx
@@ -22,9 +22,9 @@
       <w:r>
         <w:rPr>
           <w:color w:val="1E3A8A"/>
-          <w:sz w:val="25"/>
+          <w:sz w:val="24"/>
         </w:rPr>
-        <w:t>2-Stage Quant Funnel Multi-LLM Consensus Autonomous Trading System (Dual-Directional BUY &amp; SELL Specification)</w:t>
+        <w:t>2-Stage Quant Funnel Multi-LLM Consensus Autonomous Trading System (Strict Unanimous 3/3 &amp; Dual-Directional Equivalence)</w:t>
       </w:r>
     </w:p>
     <w:tbl>
@@ -267,7 +267,7 @@
                 <w:color w:val="1E293B"/>
                 <w:sz w:val="17"/>
               </w:rPr>
-              <w:t>Symmetry Architecture</w:t>
+              <w:t>Consensus Protocol</w:t>
             </w:r>
           </w:p>
         </w:tc>
@@ -291,7 +291,7 @@
                 <w:color w:val="1E293B"/>
                 <w:sz w:val="17"/>
               </w:rPr>
-              <w:t>Dual-Directional Equivalence (100% Simetris BUY &amp; SELL Logic Gates, SBR/RBS, CSM Matrix)</w:t>
+              <w:t>Strict Unanimous 3/3 Rule (Wajib 3/3 Model Searah; 2/3 atau Split = HOLD Otomatis)</w:t>
             </w:r>
           </w:p>
         </w:tc>
@@ -317,7 +317,7 @@
                 <w:color w:val="1E293B"/>
                 <w:sz w:val="17"/>
               </w:rPr>
-              <w:t>AI Consensus Engine</w:t>
+              <w:t>Symmetry Architecture</w:t>
             </w:r>
           </w:p>
         </w:tc>
@@ -341,7 +341,7 @@
                 <w:color w:val="1E293B"/>
                 <w:sz w:val="17"/>
               </w:rPr>
-              <w:t>AI_FIXED_MODE = 'triple' (Pass 1: OpenAI o4-mini + Gemini 3.1-Flash | Pass 2: DeepSeek V4-Flash CRO)</w:t>
+              <w:t>Dual-Directional Equivalence (100% Simetris BUY &amp; SELL Logic Gates, SBR/RBS, CSM Matrix)</w:t>
             </w:r>
           </w:p>
         </w:tc>
@@ -414,12 +414,12 @@
           <w:color w:val="0F172A"/>
           <w:sz w:val="30"/>
         </w:rPr>
-        <w:t>Bab 1: Executive Architecture &amp; High-Level Design</w:t>
+        <w:t>Bab 1: Executive Architecture &amp; Funnel Overview</w:t>
       </w:r>
     </w:p>
     <w:p>
       <w:r>
-        <w:t>Sistem trading ini dirancang dengan prinsip simetri kuantitatif dua arah (Dual-Directional Equivalence), di mana setiap aturan, filter likuiditas, formula matematis, dan pembacaan arus modal diterapkan secara setara untuk posisi Long (BUY) maupun Short (SELL).</w:t>
+        <w:t>Sistem trading ini memisahkan pemindaian pasar berfrekuensi tinggi (Stage 1 Fast Radar 60 detik) dari evaluasi kognitif mendalam (Stage 2 3-LLM Consensus Jury).</w:t>
       </w:r>
     </w:p>
     <w:tbl>
@@ -460,7 +460,7 @@
               <w:br/>
               <w:t>|  Universe: 27 Simbol Paralel | Sockets: MN1, W1, D1, H4, H1, M30                  |</w:t>
               <w:br/>
-              <w:t>|  [M1: Judas Sweep]    [M2: Pullback Retest]    [M3: Weekly Wall Reversal]         |</w:t>
+              <w:t>|  [M1: Judas Sweep]    [M2: Pullback Retest]    [M3: Multi-Touch Breakout Retest]  |</w:t>
               <w:br/>
               <w:t>|  [BUY: Diskon + RBS]  [SELL: Premium + SBR]    [CSM 8-Basket Dual-Horizon Flow]   |</w:t>
               <w:br/>
@@ -480,7 +480,9 @@
               <w:br/>
               <w:t>|  VETO GATES: 11 Bendera Risiko (Anti-Falling Knife BUY / Anti-Rocket FOMO SELL)   |</w:t>
               <w:br/>
-              <w:t>|  KONSENSUS : Skor Confidence &gt;= 1.20 | Unanimous 3/3 Split 2 Posisi (+25% Boost)  |</w:t>
+              <w:t>|  KONSENSUS : STRICT UNANIMOUS 3/3 (Wajib 3/3 Searah; Split = HOLD)                |</w:t>
+              <w:br/>
+              <w:t>|  SPLIT BOOST: Unanimous 3/3 + Confidence &gt;= 75% -&gt; 2 Tiket Posisi (+25% Boost)    |</w:t>
               <w:br/>
               <w:t>+-----------------------------------------+-----------------------------------------+</w:t>
               <w:br/>
@@ -521,839 +523,7 @@
           <w:color w:val="0F172A"/>
           <w:sz w:val="30"/>
         </w:rPr>
-        <w:t>Bab 2: Fractal Multi-Timeframe Hierarchy &amp; 27-Symbol Universe</w:t>
-      </w:r>
-    </w:p>
-    <w:p>
-      <w:r>
-        <w:t>Sistem beroperasi pada 6 soket timeframe native MT5 secara hierarkis tanpa jeda pembacaan data disk:</w:t>
-      </w:r>
-    </w:p>
-    <w:tbl>
-      <w:tblPr>
-        <w:tblW w:type="auto" w:w="0"/>
-        <w:jc w:val="center"/>
-        <w:tblLayout w:type="fixed"/>
-        <w:tblLook w:firstColumn="1" w:firstRow="1" w:lastColumn="0" w:lastRow="0" w:noHBand="0" w:noVBand="1" w:val="04A0"/>
-      </w:tblPr>
-      <w:tblGrid>
-        <w:gridCol w:w="2484"/>
-        <w:gridCol w:w="2484"/>
-        <w:gridCol w:w="2484"/>
-        <w:gridCol w:w="2484"/>
-      </w:tblGrid>
-      <w:tr>
-        <w:tc>
-          <w:tcPr>
-            <w:tcW w:type="dxa" w:w="1584"/>
-            <w:shd w:fill="0f172a"/>
-            <w:tcMar>
-              <w:top w:w="120" w:type="dxa"/>
-              <w:bottom w:w="120" w:type="dxa"/>
-              <w:left w:w="120" w:type="dxa"/>
-              <w:right w:w="120" w:type="dxa"/>
-            </w:tcMar>
-          </w:tcPr>
-          <w:p>
-            <w:pPr>
-              <w:spacing w:after="0"/>
-            </w:pPr>
-            <w:r>
-              <w:rPr>
-                <w:b/>
-                <w:color w:val="FFFFFF"/>
-                <w:sz w:val="18"/>
-              </w:rPr>
-              <w:t>Timeframe</w:t>
-            </w:r>
-          </w:p>
-        </w:tc>
-        <w:tc>
-          <w:tcPr>
-            <w:tcW w:type="dxa" w:w="1728"/>
-            <w:shd w:fill="0f172a"/>
-            <w:tcMar>
-              <w:top w:w="120" w:type="dxa"/>
-              <w:bottom w:w="120" w:type="dxa"/>
-              <w:left w:w="120" w:type="dxa"/>
-              <w:right w:w="120" w:type="dxa"/>
-            </w:tcMar>
-          </w:tcPr>
-          <w:p>
-            <w:pPr>
-              <w:spacing w:after="0"/>
-            </w:pPr>
-            <w:r>
-              <w:rPr>
-                <w:b/>
-                <w:color w:val="FFFFFF"/>
-                <w:sz w:val="18"/>
-              </w:rPr>
-              <w:t>Kedalaman Data</w:t>
-            </w:r>
-          </w:p>
-        </w:tc>
-        <w:tc>
-          <w:tcPr>
-            <w:tcW w:type="dxa" w:w="3888"/>
-            <w:shd w:fill="0f172a"/>
-            <w:tcMar>
-              <w:top w:w="120" w:type="dxa"/>
-              <w:bottom w:w="120" w:type="dxa"/>
-              <w:left w:w="120" w:type="dxa"/>
-              <w:right w:w="120" w:type="dxa"/>
-            </w:tcMar>
-          </w:tcPr>
-          <w:p>
-            <w:pPr>
-              <w:spacing w:after="0"/>
-            </w:pPr>
-            <w:r>
-              <w:rPr>
-                <w:b/>
-                <w:color w:val="FFFFFF"/>
-                <w:sz w:val="18"/>
-              </w:rPr>
-              <w:t>Peran &amp; Fungsi Kuantitatif</w:t>
-            </w:r>
-          </w:p>
-        </w:tc>
-        <w:tc>
-          <w:tcPr>
-            <w:tcW w:type="dxa" w:w="2448"/>
-            <w:shd w:fill="0f172a"/>
-            <w:tcMar>
-              <w:top w:w="120" w:type="dxa"/>
-              <w:bottom w:w="120" w:type="dxa"/>
-              <w:left w:w="120" w:type="dxa"/>
-              <w:right w:w="120" w:type="dxa"/>
-            </w:tcMar>
-          </w:tcPr>
-          <w:p>
-            <w:pPr>
-              <w:spacing w:after="0"/>
-            </w:pPr>
-            <w:r>
-              <w:rPr>
-                <w:b/>
-                <w:color w:val="FFFFFF"/>
-                <w:sz w:val="18"/>
-              </w:rPr>
-              <w:t>Eksekusi / Trigger</w:t>
-            </w:r>
-          </w:p>
-        </w:tc>
-      </w:tr>
-      <w:tr>
-        <w:tc>
-          <w:tcPr>
-            <w:tcW w:type="dxa" w:w="1584"/>
-            <w:shd w:fill="ffffff"/>
-            <w:tcMar>
-              <w:top w:w="100" w:type="dxa"/>
-              <w:bottom w:w="100" w:type="dxa"/>
-              <w:left w:w="120" w:type="dxa"/>
-              <w:right w:w="120" w:type="dxa"/>
-            </w:tcMar>
-          </w:tcPr>
-          <w:p>
-            <w:pPr>
-              <w:spacing w:after="0"/>
-            </w:pPr>
-            <w:r>
-              <w:rPr>
-                <w:color w:val="1E293B"/>
-                <w:sz w:val="17"/>
-              </w:rPr>
-              <w:t>MN1 (Monthly)</w:t>
-            </w:r>
-          </w:p>
-        </w:tc>
-        <w:tc>
-          <w:tcPr>
-            <w:tcW w:type="dxa" w:w="1728"/>
-            <w:shd w:fill="ffffff"/>
-            <w:tcMar>
-              <w:top w:w="100" w:type="dxa"/>
-              <w:bottom w:w="100" w:type="dxa"/>
-              <w:left w:w="120" w:type="dxa"/>
-              <w:right w:w="120" w:type="dxa"/>
-            </w:tcMar>
-          </w:tcPr>
-          <w:p>
-            <w:pPr>
-              <w:spacing w:after="0"/>
-            </w:pPr>
-            <w:r>
-              <w:rPr>
-                <w:color w:val="1E293B"/>
-                <w:sz w:val="17"/>
-              </w:rPr>
-              <w:t>50 Bar (~4.1 Thn)</w:t>
-            </w:r>
-          </w:p>
-        </w:tc>
-        <w:tc>
-          <w:tcPr>
-            <w:tcW w:type="dxa" w:w="3888"/>
-            <w:shd w:fill="ffffff"/>
-            <w:tcMar>
-              <w:top w:w="100" w:type="dxa"/>
-              <w:bottom w:w="100" w:type="dxa"/>
-              <w:left w:w="120" w:type="dxa"/>
-              <w:right w:w="120" w:type="dxa"/>
-            </w:tcMar>
-          </w:tcPr>
-          <w:p>
-            <w:pPr>
-              <w:spacing w:after="0"/>
-            </w:pPr>
-            <w:r>
-              <w:rPr>
-                <w:color w:val="1E293B"/>
-                <w:sz w:val="17"/>
-              </w:rPr>
-              <w:t>Penetapan tren multi-dekade dan plafon resistensi / dasar support mayor.</w:t>
-            </w:r>
-          </w:p>
-        </w:tc>
-        <w:tc>
-          <w:tcPr>
-            <w:tcW w:type="dxa" w:w="2448"/>
-            <w:shd w:fill="ffffff"/>
-            <w:tcMar>
-              <w:top w:w="100" w:type="dxa"/>
-              <w:bottom w:w="100" w:type="dxa"/>
-              <w:left w:w="120" w:type="dxa"/>
-              <w:right w:w="120" w:type="dxa"/>
-            </w:tcMar>
-          </w:tcPr>
-          <w:p>
-            <w:pPr>
-              <w:spacing w:after="0"/>
-            </w:pPr>
-            <w:r>
-              <w:rPr>
-                <w:color w:val="1E293B"/>
-                <w:sz w:val="17"/>
-              </w:rPr>
-              <w:t>Macro Anchor (0 Token)</w:t>
-            </w:r>
-          </w:p>
-        </w:tc>
-      </w:tr>
-      <w:tr>
-        <w:tc>
-          <w:tcPr>
-            <w:tcW w:type="dxa" w:w="1584"/>
-            <w:shd w:fill="f8fafc"/>
-            <w:tcMar>
-              <w:top w:w="100" w:type="dxa"/>
-              <w:bottom w:w="100" w:type="dxa"/>
-              <w:left w:w="120" w:type="dxa"/>
-              <w:right w:w="120" w:type="dxa"/>
-            </w:tcMar>
-          </w:tcPr>
-          <w:p>
-            <w:pPr>
-              <w:spacing w:after="0"/>
-            </w:pPr>
-            <w:r>
-              <w:rPr>
-                <w:color w:val="1E293B"/>
-                <w:sz w:val="17"/>
-              </w:rPr>
-              <w:t>W1 (Weekly)</w:t>
-            </w:r>
-          </w:p>
-        </w:tc>
-        <w:tc>
-          <w:tcPr>
-            <w:tcW w:type="dxa" w:w="1728"/>
-            <w:shd w:fill="f8fafc"/>
-            <w:tcMar>
-              <w:top w:w="100" w:type="dxa"/>
-              <w:bottom w:w="100" w:type="dxa"/>
-              <w:left w:w="120" w:type="dxa"/>
-              <w:right w:w="120" w:type="dxa"/>
-            </w:tcMar>
-          </w:tcPr>
-          <w:p>
-            <w:pPr>
-              <w:spacing w:after="0"/>
-            </w:pPr>
-            <w:r>
-              <w:rPr>
-                <w:color w:val="1E293B"/>
-                <w:sz w:val="17"/>
-              </w:rPr>
-              <w:t>100 Bar (~2.0 Thn)</w:t>
-            </w:r>
-          </w:p>
-        </w:tc>
-        <w:tc>
-          <w:tcPr>
-            <w:tcW w:type="dxa" w:w="3888"/>
-            <w:shd w:fill="f8fafc"/>
-            <w:tcMar>
-              <w:top w:w="100" w:type="dxa"/>
-              <w:bottom w:w="100" w:type="dxa"/>
-              <w:left w:w="120" w:type="dxa"/>
-              <w:right w:w="120" w:type="dxa"/>
-            </w:tcMar>
-          </w:tcPr>
-          <w:p>
-            <w:pPr>
-              <w:spacing w:after="0"/>
-            </w:pPr>
-            <w:r>
-              <w:rPr>
-                <w:color w:val="1E293B"/>
-                <w:sz w:val="17"/>
-              </w:rPr>
-              <w:t>Dealing Range 100-bar, Previous Week High/Low (PWH/PWL) Ceiling &amp; Floor.</w:t>
-            </w:r>
-          </w:p>
-        </w:tc>
-        <w:tc>
-          <w:tcPr>
-            <w:tcW w:type="dxa" w:w="2448"/>
-            <w:shd w:fill="f8fafc"/>
-            <w:tcMar>
-              <w:top w:w="100" w:type="dxa"/>
-              <w:bottom w:w="100" w:type="dxa"/>
-              <w:left w:w="120" w:type="dxa"/>
-              <w:right w:w="120" w:type="dxa"/>
-            </w:tcMar>
-          </w:tcPr>
-          <w:p>
-            <w:pPr>
-              <w:spacing w:after="0"/>
-            </w:pPr>
-            <w:r>
-              <w:rPr>
-                <w:color w:val="1E293B"/>
-                <w:sz w:val="17"/>
-              </w:rPr>
-              <w:t>Macro Wall Boundary</w:t>
-            </w:r>
-          </w:p>
-        </w:tc>
-      </w:tr>
-      <w:tr>
-        <w:tc>
-          <w:tcPr>
-            <w:tcW w:type="dxa" w:w="1584"/>
-            <w:shd w:fill="ffffff"/>
-            <w:tcMar>
-              <w:top w:w="100" w:type="dxa"/>
-              <w:bottom w:w="100" w:type="dxa"/>
-              <w:left w:w="120" w:type="dxa"/>
-              <w:right w:w="120" w:type="dxa"/>
-            </w:tcMar>
-          </w:tcPr>
-          <w:p>
-            <w:pPr>
-              <w:spacing w:after="0"/>
-            </w:pPr>
-            <w:r>
-              <w:rPr>
-                <w:color w:val="1E293B"/>
-                <w:sz w:val="17"/>
-              </w:rPr>
-              <w:t>D1 (Daily)</w:t>
-            </w:r>
-          </w:p>
-        </w:tc>
-        <w:tc>
-          <w:tcPr>
-            <w:tcW w:type="dxa" w:w="1728"/>
-            <w:shd w:fill="ffffff"/>
-            <w:tcMar>
-              <w:top w:w="100" w:type="dxa"/>
-              <w:bottom w:w="100" w:type="dxa"/>
-              <w:left w:w="120" w:type="dxa"/>
-              <w:right w:w="120" w:type="dxa"/>
-            </w:tcMar>
-          </w:tcPr>
-          <w:p>
-            <w:pPr>
-              <w:spacing w:after="0"/>
-            </w:pPr>
-            <w:r>
-              <w:rPr>
-                <w:color w:val="1E293B"/>
-                <w:sz w:val="17"/>
-              </w:rPr>
-              <w:t>350 Bar (~1.4 Thn)</w:t>
-            </w:r>
-          </w:p>
-        </w:tc>
-        <w:tc>
-          <w:tcPr>
-            <w:tcW w:type="dxa" w:w="3888"/>
-            <w:shd w:fill="ffffff"/>
-            <w:tcMar>
-              <w:top w:w="100" w:type="dxa"/>
-              <w:bottom w:w="100" w:type="dxa"/>
-              <w:left w:w="120" w:type="dxa"/>
-              <w:right w:w="120" w:type="dxa"/>
-            </w:tcMar>
-          </w:tcPr>
-          <w:p>
-            <w:pPr>
-              <w:spacing w:after="0"/>
-            </w:pPr>
-            <w:r>
-              <w:rPr>
-                <w:color w:val="1E293B"/>
-                <w:sz w:val="17"/>
-              </w:rPr>
-              <w:t>Daily Macro Bias, Previous Day High/Low (PDH/PDL), Daily Open (DO).</w:t>
-            </w:r>
-          </w:p>
-        </w:tc>
-        <w:tc>
-          <w:tcPr>
-            <w:tcW w:type="dxa" w:w="2448"/>
-            <w:shd w:fill="ffffff"/>
-            <w:tcMar>
-              <w:top w:w="100" w:type="dxa"/>
-              <w:bottom w:w="100" w:type="dxa"/>
-              <w:left w:w="120" w:type="dxa"/>
-              <w:right w:w="120" w:type="dxa"/>
-            </w:tcMar>
-          </w:tcPr>
-          <w:p>
-            <w:pPr>
-              <w:spacing w:after="0"/>
-            </w:pPr>
-            <w:r>
-              <w:rPr>
-                <w:color w:val="1E293B"/>
-                <w:sz w:val="17"/>
-              </w:rPr>
-              <w:t>Direction Identity Anchor</w:t>
-            </w:r>
-          </w:p>
-        </w:tc>
-      </w:tr>
-      <w:tr>
-        <w:tc>
-          <w:tcPr>
-            <w:tcW w:type="dxa" w:w="1584"/>
-            <w:shd w:fill="f8fafc"/>
-            <w:tcMar>
-              <w:top w:w="100" w:type="dxa"/>
-              <w:bottom w:w="100" w:type="dxa"/>
-              <w:left w:w="120" w:type="dxa"/>
-              <w:right w:w="120" w:type="dxa"/>
-            </w:tcMar>
-          </w:tcPr>
-          <w:p>
-            <w:pPr>
-              <w:spacing w:after="0"/>
-            </w:pPr>
-            <w:r>
-              <w:rPr>
-                <w:color w:val="1E293B"/>
-                <w:sz w:val="17"/>
-              </w:rPr>
-              <w:t>H4 (4-Hour)</w:t>
-            </w:r>
-          </w:p>
-        </w:tc>
-        <w:tc>
-          <w:tcPr>
-            <w:tcW w:type="dxa" w:w="1728"/>
-            <w:shd w:fill="f8fafc"/>
-            <w:tcMar>
-              <w:top w:w="100" w:type="dxa"/>
-              <w:bottom w:w="100" w:type="dxa"/>
-              <w:left w:w="120" w:type="dxa"/>
-              <w:right w:w="120" w:type="dxa"/>
-            </w:tcMar>
-          </w:tcPr>
-          <w:p>
-            <w:pPr>
-              <w:spacing w:after="0"/>
-            </w:pPr>
-            <w:r>
-              <w:rPr>
-                <w:color w:val="1E293B"/>
-                <w:sz w:val="17"/>
-              </w:rPr>
-              <w:t>400 Bar (~66 Hari)</w:t>
-            </w:r>
-          </w:p>
-        </w:tc>
-        <w:tc>
-          <w:tcPr>
-            <w:tcW w:type="dxa" w:w="3888"/>
-            <w:shd w:fill="f8fafc"/>
-            <w:tcMar>
-              <w:top w:w="100" w:type="dxa"/>
-              <w:bottom w:w="100" w:type="dxa"/>
-              <w:left w:w="120" w:type="dxa"/>
-              <w:right w:w="120" w:type="dxa"/>
-            </w:tcMar>
-          </w:tcPr>
-          <w:p>
-            <w:pPr>
-              <w:spacing w:after="0"/>
-            </w:pPr>
-            <w:r>
-              <w:rPr>
-                <w:color w:val="1E293B"/>
-                <w:sz w:val="17"/>
-              </w:rPr>
-              <w:t>Intermediate SBR/RBS levels, SuperTrend, EMA50 Slope Direction.</w:t>
-            </w:r>
-          </w:p>
-        </w:tc>
-        <w:tc>
-          <w:tcPr>
-            <w:tcW w:type="dxa" w:w="2448"/>
-            <w:shd w:fill="f8fafc"/>
-            <w:tcMar>
-              <w:top w:w="100" w:type="dxa"/>
-              <w:bottom w:w="100" w:type="dxa"/>
-              <w:left w:w="120" w:type="dxa"/>
-              <w:right w:w="120" w:type="dxa"/>
-            </w:tcMar>
-          </w:tcPr>
-          <w:p>
-            <w:pPr>
-              <w:spacing w:after="0"/>
-            </w:pPr>
-            <w:r>
-              <w:rPr>
-                <w:color w:val="1E293B"/>
-                <w:sz w:val="17"/>
-              </w:rPr>
-              <w:t>Intermediate Trend Filter</w:t>
-            </w:r>
-          </w:p>
-        </w:tc>
-      </w:tr>
-      <w:tr>
-        <w:tc>
-          <w:tcPr>
-            <w:tcW w:type="dxa" w:w="1584"/>
-            <w:shd w:fill="ffffff"/>
-            <w:tcMar>
-              <w:top w:w="100" w:type="dxa"/>
-              <w:bottom w:w="100" w:type="dxa"/>
-              <w:left w:w="120" w:type="dxa"/>
-              <w:right w:w="120" w:type="dxa"/>
-            </w:tcMar>
-          </w:tcPr>
-          <w:p>
-            <w:pPr>
-              <w:spacing w:after="0"/>
-            </w:pPr>
-            <w:r>
-              <w:rPr>
-                <w:color w:val="1E293B"/>
-                <w:sz w:val="17"/>
-              </w:rPr>
-              <w:t>H1 (1-Hour)</w:t>
-            </w:r>
-          </w:p>
-        </w:tc>
-        <w:tc>
-          <w:tcPr>
-            <w:tcW w:type="dxa" w:w="1728"/>
-            <w:shd w:fill="ffffff"/>
-            <w:tcMar>
-              <w:top w:w="100" w:type="dxa"/>
-              <w:bottom w:w="100" w:type="dxa"/>
-              <w:left w:w="120" w:type="dxa"/>
-              <w:right w:w="120" w:type="dxa"/>
-            </w:tcMar>
-          </w:tcPr>
-          <w:p>
-            <w:pPr>
-              <w:spacing w:after="0"/>
-            </w:pPr>
-            <w:r>
-              <w:rPr>
-                <w:color w:val="1E293B"/>
-                <w:sz w:val="17"/>
-              </w:rPr>
-              <w:t>250 Bar (~10 Hari)</w:t>
-            </w:r>
-          </w:p>
-        </w:tc>
-        <w:tc>
-          <w:tcPr>
-            <w:tcW w:type="dxa" w:w="3888"/>
-            <w:shd w:fill="ffffff"/>
-            <w:tcMar>
-              <w:top w:w="100" w:type="dxa"/>
-              <w:bottom w:w="100" w:type="dxa"/>
-              <w:left w:w="120" w:type="dxa"/>
-              <w:right w:w="120" w:type="dxa"/>
-            </w:tcMar>
-          </w:tcPr>
-          <w:p>
-            <w:pPr>
-              <w:spacing w:after="0"/>
-            </w:pPr>
-            <w:r>
-              <w:rPr>
-                <w:color w:val="1E293B"/>
-                <w:sz w:val="17"/>
-              </w:rPr>
-              <w:t>Primary Radar Execution Timeframe untuk 21 FX Majors &amp; Crosses.</w:t>
-            </w:r>
-          </w:p>
-        </w:tc>
-        <w:tc>
-          <w:tcPr>
-            <w:tcW w:type="dxa" w:w="2448"/>
-            <w:shd w:fill="ffffff"/>
-            <w:tcMar>
-              <w:top w:w="100" w:type="dxa"/>
-              <w:bottom w:w="100" w:type="dxa"/>
-              <w:left w:w="120" w:type="dxa"/>
-              <w:right w:w="120" w:type="dxa"/>
-            </w:tcMar>
-          </w:tcPr>
-          <w:p>
-            <w:pPr>
-              <w:spacing w:after="0"/>
-            </w:pPr>
-            <w:r>
-              <w:rPr>
-                <w:color w:val="1E293B"/>
-                <w:sz w:val="17"/>
-              </w:rPr>
-              <w:t>Fast Execution Trigger</w:t>
-            </w:r>
-          </w:p>
-        </w:tc>
-      </w:tr>
-      <w:tr>
-        <w:tc>
-          <w:tcPr>
-            <w:tcW w:type="dxa" w:w="1584"/>
-            <w:shd w:fill="f8fafc"/>
-            <w:tcMar>
-              <w:top w:w="100" w:type="dxa"/>
-              <w:bottom w:w="100" w:type="dxa"/>
-              <w:left w:w="120" w:type="dxa"/>
-              <w:right w:w="120" w:type="dxa"/>
-            </w:tcMar>
-          </w:tcPr>
-          <w:p>
-            <w:pPr>
-              <w:spacing w:after="0"/>
-            </w:pPr>
-            <w:r>
-              <w:rPr>
-                <w:color w:val="1E293B"/>
-                <w:sz w:val="17"/>
-              </w:rPr>
-              <w:t>M30 (30-Min)</w:t>
-            </w:r>
-          </w:p>
-        </w:tc>
-        <w:tc>
-          <w:tcPr>
-            <w:tcW w:type="dxa" w:w="1728"/>
-            <w:shd w:fill="f8fafc"/>
-            <w:tcMar>
-              <w:top w:w="100" w:type="dxa"/>
-              <w:bottom w:w="100" w:type="dxa"/>
-              <w:left w:w="120" w:type="dxa"/>
-              <w:right w:w="120" w:type="dxa"/>
-            </w:tcMar>
-          </w:tcPr>
-          <w:p>
-            <w:pPr>
-              <w:spacing w:after="0"/>
-            </w:pPr>
-            <w:r>
-              <w:rPr>
-                <w:color w:val="1E293B"/>
-                <w:sz w:val="17"/>
-              </w:rPr>
-              <w:t>200 Bar (~4 Hari)</w:t>
-            </w:r>
-          </w:p>
-        </w:tc>
-        <w:tc>
-          <w:tcPr>
-            <w:tcW w:type="dxa" w:w="3888"/>
-            <w:shd w:fill="f8fafc"/>
-            <w:tcMar>
-              <w:top w:w="100" w:type="dxa"/>
-              <w:bottom w:w="100" w:type="dxa"/>
-              <w:left w:w="120" w:type="dxa"/>
-              <w:right w:w="120" w:type="dxa"/>
-            </w:tcMar>
-          </w:tcPr>
-          <w:p>
-            <w:pPr>
-              <w:spacing w:after="0"/>
-            </w:pPr>
-            <w:r>
-              <w:rPr>
-                <w:color w:val="1E293B"/>
-                <w:sz w:val="17"/>
-              </w:rPr>
-              <w:t>Primary Radar Execution Timeframe untuk XAUUSD-ECNc &amp; JPY Crosses.</w:t>
-            </w:r>
-          </w:p>
-        </w:tc>
-        <w:tc>
-          <w:tcPr>
-            <w:tcW w:type="dxa" w:w="2448"/>
-            <w:shd w:fill="f8fafc"/>
-            <w:tcMar>
-              <w:top w:w="100" w:type="dxa"/>
-              <w:bottom w:w="100" w:type="dxa"/>
-              <w:left w:w="120" w:type="dxa"/>
-              <w:right w:w="120" w:type="dxa"/>
-            </w:tcMar>
-          </w:tcPr>
-          <w:p>
-            <w:pPr>
-              <w:spacing w:after="0"/>
-            </w:pPr>
-            <w:r>
-              <w:rPr>
-                <w:color w:val="1E293B"/>
-                <w:sz w:val="17"/>
-              </w:rPr>
-              <w:t>Gold/JPY Radar Trigger</w:t>
-            </w:r>
-          </w:p>
-        </w:tc>
-      </w:tr>
-      <w:tr>
-        <w:tc>
-          <w:tcPr>
-            <w:tcW w:type="dxa" w:w="1584"/>
-            <w:shd w:fill="ffffff"/>
-            <w:tcMar>
-              <w:top w:w="100" w:type="dxa"/>
-              <w:bottom w:w="100" w:type="dxa"/>
-              <w:left w:w="120" w:type="dxa"/>
-              <w:right w:w="120" w:type="dxa"/>
-            </w:tcMar>
-          </w:tcPr>
-          <w:p>
-            <w:pPr>
-              <w:spacing w:after="0"/>
-            </w:pPr>
-            <w:r>
-              <w:rPr>
-                <w:color w:val="1E293B"/>
-                <w:sz w:val="17"/>
-              </w:rPr>
-              <w:t>M5 (5-Min)</w:t>
-            </w:r>
-          </w:p>
-        </w:tc>
-        <w:tc>
-          <w:tcPr>
-            <w:tcW w:type="dxa" w:w="1728"/>
-            <w:shd w:fill="ffffff"/>
-            <w:tcMar>
-              <w:top w:w="100" w:type="dxa"/>
-              <w:bottom w:w="100" w:type="dxa"/>
-              <w:left w:w="120" w:type="dxa"/>
-              <w:right w:w="120" w:type="dxa"/>
-            </w:tcMar>
-          </w:tcPr>
-          <w:p>
-            <w:pPr>
-              <w:spacing w:after="0"/>
-            </w:pPr>
-            <w:r>
-              <w:rPr>
-                <w:color w:val="1E293B"/>
-                <w:sz w:val="17"/>
-              </w:rPr>
-              <w:t>24 Bar (2 Jam)</w:t>
-            </w:r>
-          </w:p>
-        </w:tc>
-        <w:tc>
-          <w:tcPr>
-            <w:tcW w:type="dxa" w:w="3888"/>
-            <w:shd w:fill="ffffff"/>
-            <w:tcMar>
-              <w:top w:w="100" w:type="dxa"/>
-              <w:bottom w:w="100" w:type="dxa"/>
-              <w:left w:w="120" w:type="dxa"/>
-              <w:right w:w="120" w:type="dxa"/>
-            </w:tcMar>
-          </w:tcPr>
-          <w:p>
-            <w:pPr>
-              <w:spacing w:after="0"/>
-            </w:pPr>
-            <w:r>
-              <w:rPr>
-                <w:color w:val="1E293B"/>
-                <w:sz w:val="17"/>
-              </w:rPr>
-              <w:t>Mikroskop Audit Pass 2 DeepSeek CRO (Rejection Wicks &amp; Micro Flow).</w:t>
-            </w:r>
-          </w:p>
-        </w:tc>
-        <w:tc>
-          <w:tcPr>
-            <w:tcW w:type="dxa" w:w="2448"/>
-            <w:shd w:fill="ffffff"/>
-            <w:tcMar>
-              <w:top w:w="100" w:type="dxa"/>
-              <w:bottom w:w="100" w:type="dxa"/>
-              <w:left w:w="120" w:type="dxa"/>
-              <w:right w:w="120" w:type="dxa"/>
-            </w:tcMar>
-          </w:tcPr>
-          <w:p>
-            <w:pPr>
-              <w:spacing w:after="0"/>
-            </w:pPr>
-            <w:r>
-              <w:rPr>
-                <w:color w:val="1E293B"/>
-                <w:sz w:val="17"/>
-              </w:rPr>
-              <w:t>Pass 2 CRO Audit Only</w:t>
-            </w:r>
-          </w:p>
-        </w:tc>
-      </w:tr>
-    </w:tbl>
-    <w:p>
-      <w:pPr>
-        <w:spacing w:after="120"/>
-      </w:pPr>
-    </w:p>
-    <w:p>
-      <w:pPr>
-        <w:pStyle w:val="Heading1"/>
-        <w:keepNext/>
-        <w:spacing w:before="360" w:after="120"/>
-      </w:pPr>
-      <w:r>
-        <w:rPr>
-          <w:b/>
-          <w:color w:val="0F172A"/>
-          <w:sz w:val="30"/>
-        </w:rPr>
-        <w:t>Bab 3: Stage 1 Radar — Spesifikasi Presisi BUY vs SELL</w:t>
-      </w:r>
-    </w:p>
-    <w:p>
-      <w:r>
-        <w:t>Stage 1 Fast Radar mengevaluasi kondisi pasar secara simetris untuk peluang BUY dan SELL:</w:t>
+        <w:t>Bab 3: Stage 1 Radar — Trio Mekanisme Presisi (M1, M2, M3)</w:t>
       </w:r>
     </w:p>
     <w:p>
@@ -2476,7 +1646,7 @@
           <w:color w:val="1E3A8A"/>
           <w:sz w:val="25"/>
         </w:rPr>
-        <w:t>3.3 Mekanisme 3: HTF Weekly Wall Reversal &amp; Foothold Targeting (M3)</w:t>
+        <w:t>3.3 Mekanisme 3: Multi-Touch Cluster Breakout &amp; Delayed Retest (M3)</w:t>
       </w:r>
     </w:p>
     <w:tbl>
@@ -2538,7 +1708,7 @@
                 <w:color w:val="FFFFFF"/>
                 <w:sz w:val="18"/>
               </w:rPr>
-              <w:t>Skenario BUY (Bounce from Floor)</w:t>
+              <w:t>Skenario BUY (Bullish Breakout Retest)</w:t>
             </w:r>
           </w:p>
         </w:tc>
@@ -2563,7 +1733,7 @@
                 <w:color w:val="FFFFFF"/>
                 <w:sz w:val="18"/>
               </w:rPr>
-              <w:t>Skenario SELL (Rejection from Ceiling)</w:t>
+              <w:t>Skenario SELL (Bearish Breakdown Retest)</w:t>
             </w:r>
           </w:p>
         </w:tc>
@@ -2589,7 +1759,7 @@
                 <w:color w:val="1E293B"/>
                 <w:sz w:val="17"/>
               </w:rPr>
-              <w:t>Macro Wall Collision</w:t>
+              <w:t>Cluster Touch Count</w:t>
             </w:r>
           </w:p>
         </w:tc>
@@ -2613,7 +1783,7 @@
                 <w:color w:val="1E293B"/>
                 <w:sz w:val="17"/>
               </w:rPr>
-              <w:t>Harga menguji PWL Floor atau Sub-Floor Station 100-pip.</w:t>
+              <w:t>Cluster Resistance telah diuji &gt;= 2 kali (touches &gt;= 2).</w:t>
             </w:r>
           </w:p>
         </w:tc>
@@ -2637,7 +1807,7 @@
                 <w:color w:val="1E293B"/>
                 <w:sz w:val="17"/>
               </w:rPr>
-              <w:t>Harga menguji PWH Ceiling atau Sub-Ceiling Station 100-pip.</w:t>
+              <w:t>Cluster Support telah diuji &gt;= 2 kali (touches &gt;= 2).</w:t>
             </w:r>
           </w:p>
         </w:tc>
@@ -2663,7 +1833,7 @@
                 <w:color w:val="1E293B"/>
                 <w:sz w:val="17"/>
               </w:rPr>
-              <w:t>Foothold Confirmation</w:t>
+              <w:t>Breakout Validation</w:t>
             </w:r>
           </w:p>
         </w:tc>
@@ -2687,7 +1857,7 @@
                 <w:color w:val="1E293B"/>
                 <w:sz w:val="17"/>
               </w:rPr>
-              <w:t>Lilin H1 ditutup di atas level support stasiun.</w:t>
+              <w:t>Harga menembus di atas resistance cluster &gt;= 0.10x ATR.</w:t>
             </w:r>
           </w:p>
         </w:tc>
@@ -2711,7 +1881,7 @@
                 <w:color w:val="1E293B"/>
                 <w:sz w:val="17"/>
               </w:rPr>
-              <w:t>Lilin H1 ditutup di bawah level resistance stasiun.</w:t>
+              <w:t>Harga menembus di bawah support cluster &gt;= 0.10x ATR.</w:t>
             </w:r>
           </w:p>
         </w:tc>
@@ -2737,7 +1907,7 @@
                 <w:color w:val="1E293B"/>
                 <w:sz w:val="17"/>
               </w:rPr>
-              <w:t>Target Koridor Estafet</w:t>
+              <w:t>Delayed Retest Entry</w:t>
             </w:r>
           </w:p>
         </w:tc>
@@ -2761,7 +1931,7 @@
                 <w:color w:val="1E293B"/>
                 <w:sz w:val="17"/>
               </w:rPr>
-              <w:t>Target TP = 50% Equilibrium Dealing Range &amp; Next Station.</w:t>
+              <w:t>Buy Limit dipasang tepat di level cluster_resistance - 0.5x spread.</w:t>
             </w:r>
           </w:p>
         </w:tc>
@@ -2785,7 +1955,7 @@
                 <w:color w:val="1E293B"/>
                 <w:sz w:val="17"/>
               </w:rPr>
-              <w:t>Target TP = 50% Equilibrium Dealing Range &amp; Lower Station.</w:t>
+              <w:t>Sell Limit dipasang tepat di level cluster_support + 0.5x spread.</w:t>
             </w:r>
           </w:p>
         </w:tc>
@@ -2811,7 +1981,7 @@
                 <w:color w:val="1E293B"/>
                 <w:sz w:val="17"/>
               </w:rPr>
-              <w:t>Invalidation SL</w:t>
+              <w:t>Macro Corridor Gate</w:t>
             </w:r>
           </w:p>
         </w:tc>
@@ -2835,7 +2005,7 @@
                 <w:color w:val="1E293B"/>
                 <w:sz w:val="17"/>
               </w:rPr>
-              <w:t>SL diletakkan di bawah titik terendah swing (PWL) + Buffer.</w:t>
+              <w:t>Macro Corridor wajib BULLISH (Dilarang trade di Bearish Corridor).</w:t>
             </w:r>
           </w:p>
         </w:tc>
@@ -2859,122 +2029,7 @@
                 <w:color w:val="1E293B"/>
                 <w:sz w:val="17"/>
               </w:rPr>
-              <w:t>SL diletakkan di atas titik tertinggi swing (PWH) + Buffer.</w:t>
-            </w:r>
-          </w:p>
-        </w:tc>
-      </w:tr>
-    </w:tbl>
-    <w:p>
-      <w:pPr>
-        <w:spacing w:after="120"/>
-      </w:pPr>
-    </w:p>
-    <w:p>
-      <w:pPr>
-        <w:pStyle w:val="Heading1"/>
-        <w:keepNext/>
-        <w:spacing w:before="360" w:after="120"/>
-      </w:pPr>
-      <w:r>
-        <w:rPr>
-          <w:b/>
-          <w:color w:val="0F172A"/>
-          <w:sz w:val="30"/>
-        </w:rPr>
-        <w:t>Bab 4: 4-Dimensional Market State Engine (wave_state.py)</w:t>
-      </w:r>
-    </w:p>
-    <w:p>
-      <w:r>
-        <w:t>Engine FSM memisahkan Direction (D1/H4) vs Trade Permission (H1 Wave + CSM). Berikut matriks simetris BUY &amp; SELL:</w:t>
-      </w:r>
-    </w:p>
-    <w:tbl>
-      <w:tblPr>
-        <w:tblW w:type="auto" w:w="0"/>
-        <w:jc w:val="center"/>
-        <w:tblLayout w:type="fixed"/>
-        <w:tblLook w:firstColumn="1" w:firstRow="1" w:lastColumn="0" w:lastRow="0" w:noHBand="0" w:noVBand="1" w:val="04A0"/>
-      </w:tblPr>
-      <w:tblGrid>
-        <w:gridCol w:w="3312"/>
-        <w:gridCol w:w="3312"/>
-        <w:gridCol w:w="3312"/>
-      </w:tblGrid>
-      <w:tr>
-        <w:tc>
-          <w:tcPr>
-            <w:tcW w:type="dxa" w:w="2592"/>
-            <w:shd w:fill="0f172a"/>
-            <w:tcMar>
-              <w:top w:w="120" w:type="dxa"/>
-              <w:bottom w:w="120" w:type="dxa"/>
-              <w:left w:w="120" w:type="dxa"/>
-              <w:right w:w="120" w:type="dxa"/>
-            </w:tcMar>
-          </w:tcPr>
-          <w:p>
-            <w:pPr>
-              <w:spacing w:after="0"/>
-            </w:pPr>
-            <w:r>
-              <w:rPr>
-                <w:b/>
-                <w:color w:val="FFFFFF"/>
-                <w:sz w:val="18"/>
-              </w:rPr>
-              <w:t>Fase Siklus Wave</w:t>
-            </w:r>
-          </w:p>
-        </w:tc>
-        <w:tc>
-          <w:tcPr>
-            <w:tcW w:type="dxa" w:w="3456"/>
-            <w:shd w:fill="0f172a"/>
-            <w:tcMar>
-              <w:top w:w="120" w:type="dxa"/>
-              <w:bottom w:w="120" w:type="dxa"/>
-              <w:left w:w="120" w:type="dxa"/>
-              <w:right w:w="120" w:type="dxa"/>
-            </w:tcMar>
-          </w:tcPr>
-          <w:p>
-            <w:pPr>
-              <w:spacing w:after="0"/>
-            </w:pPr>
-            <w:r>
-              <w:rPr>
-                <w:b/>
-                <w:color w:val="FFFFFF"/>
-                <w:sz w:val="18"/>
-              </w:rPr>
-              <w:t>Kondisi Pasar BULLISH (Arah BUY)</w:t>
-            </w:r>
-          </w:p>
-        </w:tc>
-        <w:tc>
-          <w:tcPr>
-            <w:tcW w:type="dxa" w:w="3600"/>
-            <w:shd w:fill="0f172a"/>
-            <w:tcMar>
-              <w:top w:w="120" w:type="dxa"/>
-              <w:bottom w:w="120" w:type="dxa"/>
-              <w:left w:w="120" w:type="dxa"/>
-              <w:right w:w="120" w:type="dxa"/>
-            </w:tcMar>
-          </w:tcPr>
-          <w:p>
-            <w:pPr>
-              <w:spacing w:after="0"/>
-            </w:pPr>
-            <w:r>
-              <w:rPr>
-                <w:b/>
-                <w:color w:val="FFFFFF"/>
-                <w:sz w:val="18"/>
-              </w:rPr>
-              <w:t>Kondisi Pasar BEARISH (Arah SELL)</w:t>
+              <w:t>Macro Corridor wajib BEARISH (Dilarang trade di Bullish Corridor).</w:t>
             </w:r>
           </w:p>
         </w:tc>
@@ -3000,7 +2055,7 @@
                 <w:color w:val="1E293B"/>
                 <w:sz w:val="17"/>
               </w:rPr>
-              <w:t>Phase 1: Impulse (WAIT)</w:t>
+              <w:t>Structural Invalidation</w:t>
             </w:r>
           </w:p>
         </w:tc>
@@ -3024,7 +2079,7 @@
                 <w:color w:val="1E293B"/>
                 <w:sz w:val="17"/>
               </w:rPr>
-              <w:t>Harga melonjak tajam menjauhi EMA20. Permission = WAIT (Dilarang mengejar BUY di pucuk).</w:t>
+              <w:t>SL di balik Support RBS + 0.35x ATR + Spread (&lt;= 160 pts).</w:t>
             </w:r>
           </w:p>
         </w:tc>
@@ -3048,229 +2103,7 @@
                 <w:color w:val="1E293B"/>
                 <w:sz w:val="17"/>
               </w:rPr>
-              <w:t>Harga anjlok tajam menjauhi EMA20. Permission = WAIT (Dilarang mengejar SELL di dasar).</w:t>
-            </w:r>
-          </w:p>
-        </w:tc>
-      </w:tr>
-      <w:tr>
-        <w:tc>
-          <w:tcPr>
-            <w:tcW w:type="dxa" w:w="2592"/>
-            <w:shd w:fill="f8fafc"/>
-            <w:tcMar>
-              <w:top w:w="100" w:type="dxa"/>
-              <w:bottom w:w="100" w:type="dxa"/>
-              <w:left w:w="120" w:type="dxa"/>
-              <w:right w:w="120" w:type="dxa"/>
-            </w:tcMar>
-          </w:tcPr>
-          <w:p>
-            <w:pPr>
-              <w:spacing w:after="0"/>
-            </w:pPr>
-            <w:r>
-              <w:rPr>
-                <w:color w:val="1E293B"/>
-                <w:sz w:val="17"/>
-              </w:rPr>
-              <w:t>Phase 2: Waterfall (LOCK)</w:t>
-            </w:r>
-          </w:p>
-        </w:tc>
-        <w:tc>
-          <w:tcPr>
-            <w:tcW w:type="dxa" w:w="3456"/>
-            <w:shd w:fill="f8fafc"/>
-            <w:tcMar>
-              <w:top w:w="100" w:type="dxa"/>
-              <w:bottom w:w="100" w:type="dxa"/>
-              <w:left w:w="120" w:type="dxa"/>
-              <w:right w:w="120" w:type="dxa"/>
-            </w:tcMar>
-          </w:tcPr>
-          <w:p>
-            <w:pPr>
-              <w:spacing w:after="0"/>
-            </w:pPr>
-            <w:r>
-              <w:rPr>
-                <w:color w:val="1E293B"/>
-                <w:sz w:val="17"/>
-              </w:rPr>
-              <w:t>Harga mengalami koreksi tajam beruntun. Permission = LOCK (Dilarang menangkap pisau jatuh).</w:t>
-            </w:r>
-          </w:p>
-        </w:tc>
-        <w:tc>
-          <w:tcPr>
-            <w:tcW w:type="dxa" w:w="3600"/>
-            <w:shd w:fill="f8fafc"/>
-            <w:tcMar>
-              <w:top w:w="100" w:type="dxa"/>
-              <w:bottom w:w="100" w:type="dxa"/>
-              <w:left w:w="120" w:type="dxa"/>
-              <w:right w:w="120" w:type="dxa"/>
-            </w:tcMar>
-          </w:tcPr>
-          <w:p>
-            <w:pPr>
-              <w:spacing w:after="0"/>
-            </w:pPr>
-            <w:r>
-              <w:rPr>
-                <w:color w:val="1E293B"/>
-                <w:sz w:val="17"/>
-              </w:rPr>
-              <w:t>Harga mengalami rebound tajam beruntun. Permission = LOCK (Dilarang menghadang roket).</w:t>
-            </w:r>
-          </w:p>
-        </w:tc>
-      </w:tr>
-      <w:tr>
-        <w:tc>
-          <w:tcPr>
-            <w:tcW w:type="dxa" w:w="2592"/>
-            <w:shd w:fill="ffffff"/>
-            <w:tcMar>
-              <w:top w:w="100" w:type="dxa"/>
-              <w:bottom w:w="100" w:type="dxa"/>
-              <w:left w:w="120" w:type="dxa"/>
-              <w:right w:w="120" w:type="dxa"/>
-            </w:tcMar>
-          </w:tcPr>
-          <w:p>
-            <w:pPr>
-              <w:spacing w:after="0"/>
-            </w:pPr>
-            <w:r>
-              <w:rPr>
-                <w:color w:val="1E293B"/>
-                <w:sz w:val="17"/>
-              </w:rPr>
-              <w:t>Phase 3: Mature Basing (ARM)</w:t>
-            </w:r>
-          </w:p>
-        </w:tc>
-        <w:tc>
-          <w:tcPr>
-            <w:tcW w:type="dxa" w:w="3456"/>
-            <w:shd w:fill="ffffff"/>
-            <w:tcMar>
-              <w:top w:w="100" w:type="dxa"/>
-              <w:bottom w:w="100" w:type="dxa"/>
-              <w:left w:w="120" w:type="dxa"/>
-              <w:right w:w="120" w:type="dxa"/>
-            </w:tcMar>
-          </w:tcPr>
-          <w:p>
-            <w:pPr>
-              <w:spacing w:after="0"/>
-            </w:pPr>
-            <w:r>
-              <w:rPr>
-                <w:color w:val="1E293B"/>
-                <w:sz w:val="17"/>
-              </w:rPr>
-              <w:t>Pelemahan momentum koreksi di zona diskon (&lt;= 0.50). Permission = ARM (Siap pasang Buy Limit).</w:t>
-            </w:r>
-          </w:p>
-        </w:tc>
-        <w:tc>
-          <w:tcPr>
-            <w:tcW w:type="dxa" w:w="3600"/>
-            <w:shd w:fill="ffffff"/>
-            <w:tcMar>
-              <w:top w:w="100" w:type="dxa"/>
-              <w:bottom w:w="100" w:type="dxa"/>
-              <w:left w:w="120" w:type="dxa"/>
-              <w:right w:w="120" w:type="dxa"/>
-            </w:tcMar>
-          </w:tcPr>
-          <w:p>
-            <w:pPr>
-              <w:spacing w:after="0"/>
-            </w:pPr>
-            <w:r>
-              <w:rPr>
-                <w:color w:val="1E293B"/>
-                <w:sz w:val="17"/>
-              </w:rPr>
-              <w:t>Pelemahan momentum rebound di zona premium (&gt;= 0.50). Permission = ARM (Siap pasang Sell Limit).</w:t>
-            </w:r>
-          </w:p>
-        </w:tc>
-      </w:tr>
-      <w:tr>
-        <w:tc>
-          <w:tcPr>
-            <w:tcW w:type="dxa" w:w="2592"/>
-            <w:shd w:fill="f8fafc"/>
-            <w:tcMar>
-              <w:top w:w="100" w:type="dxa"/>
-              <w:bottom w:w="100" w:type="dxa"/>
-              <w:left w:w="120" w:type="dxa"/>
-              <w:right w:w="120" w:type="dxa"/>
-            </w:tcMar>
-          </w:tcPr>
-          <w:p>
-            <w:pPr>
-              <w:spacing w:after="0"/>
-            </w:pPr>
-            <w:r>
-              <w:rPr>
-                <w:color w:val="1E293B"/>
-                <w:sz w:val="17"/>
-              </w:rPr>
-              <w:t>Phase 4: Base Reclaim (GO)</w:t>
-            </w:r>
-          </w:p>
-        </w:tc>
-        <w:tc>
-          <w:tcPr>
-            <w:tcW w:type="dxa" w:w="3456"/>
-            <w:shd w:fill="f8fafc"/>
-            <w:tcMar>
-              <w:top w:w="100" w:type="dxa"/>
-              <w:bottom w:w="100" w:type="dxa"/>
-              <w:left w:w="120" w:type="dxa"/>
-              <w:right w:w="120" w:type="dxa"/>
-            </w:tcMar>
-          </w:tcPr>
-          <w:p>
-            <w:pPr>
-              <w:spacing w:after="0"/>
-            </w:pPr>
-            <w:r>
-              <w:rPr>
-                <w:color w:val="1E293B"/>
-                <w:sz w:val="17"/>
-              </w:rPr>
-              <w:t>Konfirmasi reclaim level support + sumbu bawah. Permission = GO (Eksekusi BUY Aktif).</w:t>
-            </w:r>
-          </w:p>
-        </w:tc>
-        <w:tc>
-          <w:tcPr>
-            <w:tcW w:type="dxa" w:w="3600"/>
-            <w:shd w:fill="f8fafc"/>
-            <w:tcMar>
-              <w:top w:w="100" w:type="dxa"/>
-              <w:bottom w:w="100" w:type="dxa"/>
-              <w:left w:w="120" w:type="dxa"/>
-              <w:right w:w="120" w:type="dxa"/>
-            </w:tcMar>
-          </w:tcPr>
-          <w:p>
-            <w:pPr>
-              <w:spacing w:after="0"/>
-            </w:pPr>
-            <w:r>
-              <w:rPr>
-                <w:color w:val="1E293B"/>
-                <w:sz w:val="17"/>
-              </w:rPr>
-              <w:t>Konfirmasi reclaim level resistance + sumbu atas. Permission = GO (Eksekusi SELL Aktif).</w:t>
+              <w:t>SL di balik Resistance SBR + 0.35x ATR + Spread (&lt;= 160 pts).</w:t>
             </w:r>
           </w:p>
         </w:tc>
@@ -3293,567 +2126,7 @@
           <w:color w:val="0F172A"/>
           <w:sz w:val="30"/>
         </w:rPr>
-        <w:t>Bab 5: Universal 8-Currency Basket Circuit Breaker (currency_strength.py)</w:t>
-      </w:r>
-    </w:p>
-    <w:p>
-      <w:r>
-        <w:t>Matriks proteksi sirkuit pasar bekerja 2 arah untuk mencegah posisi melawan arus uang institusional:</w:t>
-      </w:r>
-    </w:p>
-    <w:tbl>
-      <w:tblPr>
-        <w:tblW w:type="auto" w:w="0"/>
-        <w:jc w:val="center"/>
-        <w:tblLayout w:type="fixed"/>
-        <w:tblLook w:firstColumn="1" w:firstRow="1" w:lastColumn="0" w:lastRow="0" w:noHBand="0" w:noVBand="1" w:val="04A0"/>
-      </w:tblPr>
-      <w:tblGrid>
-        <w:gridCol w:w="3312"/>
-        <w:gridCol w:w="3312"/>
-        <w:gridCol w:w="3312"/>
-      </w:tblGrid>
-      <w:tr>
-        <w:tc>
-          <w:tcPr>
-            <w:tcW w:type="dxa" w:w="2592"/>
-            <w:shd w:fill="0f172a"/>
-            <w:tcMar>
-              <w:top w:w="120" w:type="dxa"/>
-              <w:bottom w:w="120" w:type="dxa"/>
-              <w:left w:w="120" w:type="dxa"/>
-              <w:right w:w="120" w:type="dxa"/>
-            </w:tcMar>
-          </w:tcPr>
-          <w:p>
-            <w:pPr>
-              <w:spacing w:after="0"/>
-            </w:pPr>
-            <w:r>
-              <w:rPr>
-                <w:b/>
-                <w:color w:val="FFFFFF"/>
-                <w:sz w:val="18"/>
-              </w:rPr>
-              <w:t>Kondisi Arus Modal</w:t>
-            </w:r>
-          </w:p>
-        </w:tc>
-        <w:tc>
-          <w:tcPr>
-            <w:tcW w:type="dxa" w:w="3456"/>
-            <w:shd w:fill="0f172a"/>
-            <w:tcMar>
-              <w:top w:w="120" w:type="dxa"/>
-              <w:bottom w:w="120" w:type="dxa"/>
-              <w:left w:w="120" w:type="dxa"/>
-              <w:right w:w="120" w:type="dxa"/>
-            </w:tcMar>
-          </w:tcPr>
-          <w:p>
-            <w:pPr>
-              <w:spacing w:after="0"/>
-            </w:pPr>
-            <w:r>
-              <w:rPr>
-                <w:b/>
-                <w:color w:val="FFFFFF"/>
-                <w:sz w:val="18"/>
-              </w:rPr>
-              <w:t>Dampak pada Order BUY</w:t>
-            </w:r>
-          </w:p>
-        </w:tc>
-        <w:tc>
-          <w:tcPr>
-            <w:tcW w:type="dxa" w:w="3600"/>
-            <w:shd w:fill="0f172a"/>
-            <w:tcMar>
-              <w:top w:w="120" w:type="dxa"/>
-              <w:bottom w:w="120" w:type="dxa"/>
-              <w:left w:w="120" w:type="dxa"/>
-              <w:right w:w="120" w:type="dxa"/>
-            </w:tcMar>
-          </w:tcPr>
-          <w:p>
-            <w:pPr>
-              <w:spacing w:after="0"/>
-            </w:pPr>
-            <w:r>
-              <w:rPr>
-                <w:b/>
-                <w:color w:val="FFFFFF"/>
-                <w:sz w:val="18"/>
-              </w:rPr>
-              <w:t>Dampak pada Order SELL</w:t>
-            </w:r>
-          </w:p>
-        </w:tc>
-      </w:tr>
-      <w:tr>
-        <w:tc>
-          <w:tcPr>
-            <w:tcW w:type="dxa" w:w="2592"/>
-            <w:shd w:fill="ffffff"/>
-            <w:tcMar>
-              <w:top w:w="100" w:type="dxa"/>
-              <w:bottom w:w="100" w:type="dxa"/>
-              <w:left w:w="120" w:type="dxa"/>
-              <w:right w:w="120" w:type="dxa"/>
-            </w:tcMar>
-          </w:tcPr>
-          <w:p>
-            <w:pPr>
-              <w:spacing w:after="0"/>
-            </w:pPr>
-            <w:r>
-              <w:rPr>
-                <w:color w:val="1E293B"/>
-                <w:sz w:val="17"/>
-              </w:rPr>
-              <w:t>Base Currency DUMP (&lt;= -20.0)</w:t>
-            </w:r>
-          </w:p>
-        </w:tc>
-        <w:tc>
-          <w:tcPr>
-            <w:tcW w:type="dxa" w:w="3456"/>
-            <w:shd w:fill="ffffff"/>
-            <w:tcMar>
-              <w:top w:w="100" w:type="dxa"/>
-              <w:bottom w:w="100" w:type="dxa"/>
-              <w:left w:w="120" w:type="dxa"/>
-              <w:right w:w="120" w:type="dxa"/>
-            </w:tcMar>
-          </w:tcPr>
-          <w:p>
-            <w:pPr>
-              <w:spacing w:after="0"/>
-            </w:pPr>
-            <w:r>
-              <w:rPr>
-                <w:color w:val="1E293B"/>
-                <w:sz w:val="17"/>
-              </w:rPr>
-              <w:t>HARD LOCK BUY (Dilarang beli mata uang yang sedang crash).</w:t>
-            </w:r>
-          </w:p>
-        </w:tc>
-        <w:tc>
-          <w:tcPr>
-            <w:tcW w:type="dxa" w:w="3600"/>
-            <w:shd w:fill="ffffff"/>
-            <w:tcMar>
-              <w:top w:w="100" w:type="dxa"/>
-              <w:bottom w:w="100" w:type="dxa"/>
-              <w:left w:w="120" w:type="dxa"/>
-              <w:right w:w="120" w:type="dxa"/>
-            </w:tcMar>
-          </w:tcPr>
-          <w:p>
-            <w:pPr>
-              <w:spacing w:after="0"/>
-            </w:pPr>
-            <w:r>
-              <w:rPr>
-                <w:color w:val="1E293B"/>
-                <w:sz w:val="17"/>
-              </w:rPr>
-              <w:t>OPEN SELL ENABLED (Arus searah dengan pelemahan).</w:t>
-            </w:r>
-          </w:p>
-        </w:tc>
-      </w:tr>
-      <w:tr>
-        <w:tc>
-          <w:tcPr>
-            <w:tcW w:type="dxa" w:w="2592"/>
-            <w:shd w:fill="f8fafc"/>
-            <w:tcMar>
-              <w:top w:w="100" w:type="dxa"/>
-              <w:bottom w:w="100" w:type="dxa"/>
-              <w:left w:w="120" w:type="dxa"/>
-              <w:right w:w="120" w:type="dxa"/>
-            </w:tcMar>
-          </w:tcPr>
-          <w:p>
-            <w:pPr>
-              <w:spacing w:after="0"/>
-            </w:pPr>
-            <w:r>
-              <w:rPr>
-                <w:color w:val="1E293B"/>
-                <w:sz w:val="17"/>
-              </w:rPr>
-              <w:t>Base Currency SURGE (&gt;= +20.0)</w:t>
-            </w:r>
-          </w:p>
-        </w:tc>
-        <w:tc>
-          <w:tcPr>
-            <w:tcW w:type="dxa" w:w="3456"/>
-            <w:shd w:fill="f8fafc"/>
-            <w:tcMar>
-              <w:top w:w="100" w:type="dxa"/>
-              <w:bottom w:w="100" w:type="dxa"/>
-              <w:left w:w="120" w:type="dxa"/>
-              <w:right w:w="120" w:type="dxa"/>
-            </w:tcMar>
-          </w:tcPr>
-          <w:p>
-            <w:pPr>
-              <w:spacing w:after="0"/>
-            </w:pPr>
-            <w:r>
-              <w:rPr>
-                <w:color w:val="1E293B"/>
-                <w:sz w:val="17"/>
-              </w:rPr>
-              <w:t>OPEN BUY ENABLED (Arus searah dengan penguatan).</w:t>
-            </w:r>
-          </w:p>
-        </w:tc>
-        <w:tc>
-          <w:tcPr>
-            <w:tcW w:type="dxa" w:w="3600"/>
-            <w:shd w:fill="f8fafc"/>
-            <w:tcMar>
-              <w:top w:w="100" w:type="dxa"/>
-              <w:bottom w:w="100" w:type="dxa"/>
-              <w:left w:w="120" w:type="dxa"/>
-              <w:right w:w="120" w:type="dxa"/>
-            </w:tcMar>
-          </w:tcPr>
-          <w:p>
-            <w:pPr>
-              <w:spacing w:after="0"/>
-            </w:pPr>
-            <w:r>
-              <w:rPr>
-                <w:color w:val="1E293B"/>
-                <w:sz w:val="17"/>
-              </w:rPr>
-              <w:t>HARD LOCK SELL (Dilarang short mata uang yang sedang rally).</w:t>
-            </w:r>
-          </w:p>
-        </w:tc>
-      </w:tr>
-      <w:tr>
-        <w:tc>
-          <w:tcPr>
-            <w:tcW w:type="dxa" w:w="2592"/>
-            <w:shd w:fill="ffffff"/>
-            <w:tcMar>
-              <w:top w:w="100" w:type="dxa"/>
-              <w:bottom w:w="100" w:type="dxa"/>
-              <w:left w:w="120" w:type="dxa"/>
-              <w:right w:w="120" w:type="dxa"/>
-            </w:tcMar>
-          </w:tcPr>
-          <w:p>
-            <w:pPr>
-              <w:spacing w:after="0"/>
-            </w:pPr>
-            <w:r>
-              <w:rPr>
-                <w:color w:val="1E293B"/>
-                <w:sz w:val="17"/>
-              </w:rPr>
-              <w:t>Quote Currency SURGE (&gt;= +20.0)</w:t>
-            </w:r>
-          </w:p>
-        </w:tc>
-        <w:tc>
-          <w:tcPr>
-            <w:tcW w:type="dxa" w:w="3456"/>
-            <w:shd w:fill="ffffff"/>
-            <w:tcMar>
-              <w:top w:w="100" w:type="dxa"/>
-              <w:bottom w:w="100" w:type="dxa"/>
-              <w:left w:w="120" w:type="dxa"/>
-              <w:right w:w="120" w:type="dxa"/>
-            </w:tcMar>
-          </w:tcPr>
-          <w:p>
-            <w:pPr>
-              <w:spacing w:after="0"/>
-            </w:pPr>
-            <w:r>
-              <w:rPr>
-                <w:color w:val="1E293B"/>
-                <w:sz w:val="17"/>
-              </w:rPr>
-              <w:t>HARD LOCK BUY (Quote terlalu kuat, pair akan tertekan turun).</w:t>
-            </w:r>
-          </w:p>
-        </w:tc>
-        <w:tc>
-          <w:tcPr>
-            <w:tcW w:type="dxa" w:w="3600"/>
-            <w:shd w:fill="ffffff"/>
-            <w:tcMar>
-              <w:top w:w="100" w:type="dxa"/>
-              <w:bottom w:w="100" w:type="dxa"/>
-              <w:left w:w="120" w:type="dxa"/>
-              <w:right w:w="120" w:type="dxa"/>
-            </w:tcMar>
-          </w:tcPr>
-          <w:p>
-            <w:pPr>
-              <w:spacing w:after="0"/>
-            </w:pPr>
-            <w:r>
-              <w:rPr>
-                <w:color w:val="1E293B"/>
-                <w:sz w:val="17"/>
-              </w:rPr>
-              <w:t>OPEN SELL ENABLED (Short diuntungkan oleh quote kuat).</w:t>
-            </w:r>
-          </w:p>
-        </w:tc>
-      </w:tr>
-      <w:tr>
-        <w:tc>
-          <w:tcPr>
-            <w:tcW w:type="dxa" w:w="2592"/>
-            <w:shd w:fill="f8fafc"/>
-            <w:tcMar>
-              <w:top w:w="100" w:type="dxa"/>
-              <w:bottom w:w="100" w:type="dxa"/>
-              <w:left w:w="120" w:type="dxa"/>
-              <w:right w:w="120" w:type="dxa"/>
-            </w:tcMar>
-          </w:tcPr>
-          <w:p>
-            <w:pPr>
-              <w:spacing w:after="0"/>
-            </w:pPr>
-            <w:r>
-              <w:rPr>
-                <w:color w:val="1E293B"/>
-                <w:sz w:val="17"/>
-              </w:rPr>
-              <w:t>Quote Currency DUMP (&lt;= -20.0)</w:t>
-            </w:r>
-          </w:p>
-        </w:tc>
-        <w:tc>
-          <w:tcPr>
-            <w:tcW w:type="dxa" w:w="3456"/>
-            <w:shd w:fill="f8fafc"/>
-            <w:tcMar>
-              <w:top w:w="100" w:type="dxa"/>
-              <w:bottom w:w="100" w:type="dxa"/>
-              <w:left w:w="120" w:type="dxa"/>
-              <w:right w:w="120" w:type="dxa"/>
-            </w:tcMar>
-          </w:tcPr>
-          <w:p>
-            <w:pPr>
-              <w:spacing w:after="0"/>
-            </w:pPr>
-            <w:r>
-              <w:rPr>
-                <w:color w:val="1E293B"/>
-                <w:sz w:val="17"/>
-              </w:rPr>
-              <w:t>OPEN BUY ENABLED (Long diuntungkan oleh quote lemah).</w:t>
-            </w:r>
-          </w:p>
-        </w:tc>
-        <w:tc>
-          <w:tcPr>
-            <w:tcW w:type="dxa" w:w="3600"/>
-            <w:shd w:fill="f8fafc"/>
-            <w:tcMar>
-              <w:top w:w="100" w:type="dxa"/>
-              <w:bottom w:w="100" w:type="dxa"/>
-              <w:left w:w="120" w:type="dxa"/>
-              <w:right w:w="120" w:type="dxa"/>
-            </w:tcMar>
-          </w:tcPr>
-          <w:p>
-            <w:pPr>
-              <w:spacing w:after="0"/>
-            </w:pPr>
-            <w:r>
-              <w:rPr>
-                <w:color w:val="1E293B"/>
-                <w:sz w:val="17"/>
-              </w:rPr>
-              <w:t>HARD LOCK SELL (Dilarang short saat quote sedang crash).</w:t>
-            </w:r>
-          </w:p>
-        </w:tc>
-      </w:tr>
-      <w:tr>
-        <w:tc>
-          <w:tcPr>
-            <w:tcW w:type="dxa" w:w="2592"/>
-            <w:shd w:fill="ffffff"/>
-            <w:tcMar>
-              <w:top w:w="100" w:type="dxa"/>
-              <w:bottom w:w="100" w:type="dxa"/>
-              <w:left w:w="120" w:type="dxa"/>
-              <w:right w:w="120" w:type="dxa"/>
-            </w:tcMar>
-          </w:tcPr>
-          <w:p>
-            <w:pPr>
-              <w:spacing w:after="0"/>
-            </w:pPr>
-            <w:r>
-              <w:rPr>
-                <w:color w:val="1E293B"/>
-                <w:sz w:val="17"/>
-              </w:rPr>
-              <w:t>Relative Delta Spread (|Delta| &gt;= 18.0)</w:t>
-            </w:r>
-          </w:p>
-        </w:tc>
-        <w:tc>
-          <w:tcPr>
-            <w:tcW w:type="dxa" w:w="3456"/>
-            <w:shd w:fill="ffffff"/>
-            <w:tcMar>
-              <w:top w:w="100" w:type="dxa"/>
-              <w:bottom w:w="100" w:type="dxa"/>
-              <w:left w:w="120" w:type="dxa"/>
-              <w:right w:w="120" w:type="dxa"/>
-            </w:tcMar>
-          </w:tcPr>
-          <w:p>
-            <w:pPr>
-              <w:spacing w:after="0"/>
-            </w:pPr>
-            <w:r>
-              <w:rPr>
-                <w:color w:val="1E293B"/>
-                <w:sz w:val="17"/>
-              </w:rPr>
-              <w:t>Jika Net Delta &lt;= -18.0 -&gt; HARD LOCK BUY.</w:t>
-            </w:r>
-          </w:p>
-        </w:tc>
-        <w:tc>
-          <w:tcPr>
-            <w:tcW w:type="dxa" w:w="3600"/>
-            <w:shd w:fill="ffffff"/>
-            <w:tcMar>
-              <w:top w:w="100" w:type="dxa"/>
-              <w:bottom w:w="100" w:type="dxa"/>
-              <w:left w:w="120" w:type="dxa"/>
-              <w:right w:w="120" w:type="dxa"/>
-            </w:tcMar>
-          </w:tcPr>
-          <w:p>
-            <w:pPr>
-              <w:spacing w:after="0"/>
-            </w:pPr>
-            <w:r>
-              <w:rPr>
-                <w:color w:val="1E293B"/>
-                <w:sz w:val="17"/>
-              </w:rPr>
-              <w:t>Jika Net Delta &gt;= +18.0 -&gt; HARD LOCK SELL.</w:t>
-            </w:r>
-          </w:p>
-        </w:tc>
-      </w:tr>
-    </w:tbl>
-    <w:p>
-      <w:pPr>
-        <w:spacing w:after="120"/>
-      </w:pPr>
-    </w:p>
-    <w:p>
-      <w:pPr>
-        <w:pStyle w:val="Heading1"/>
-        <w:keepNext/>
-        <w:spacing w:before="360" w:after="120"/>
-      </w:pPr>
-      <w:r>
-        <w:rPr>
-          <w:b/>
-          <w:color w:val="0F172A"/>
-          <w:sz w:val="30"/>
-        </w:rPr>
-        <w:t>Bab 6: Macro Strategic Engine (MSE) &amp; Zonal SBR/RBS</w:t>
-      </w:r>
-    </w:p>
-    <w:p>
-      <w:r>
-        <w:t>MSE memetakan support dan resistance institusional ke dalam struktur 2 arah:</w:t>
-      </w:r>
-    </w:p>
-    <w:p>
-      <w:r>
-        <w:t>• Untuk Peluang BUY (Demand Driven):</w:t>
-        <w:br/>
-        <w:t xml:space="preserve">  - RBS (Resistance-Become-Support): Mengincar retest di zona RBS yang telah ditembus sebelumnya.</w:t>
-        <w:br/>
-        <w:t xml:space="preserve">  - Proximal RBS Band: Batas atas zona support (titik entri Buy Limit paling efisien).</w:t>
-        <w:br/>
-        <w:t xml:space="preserve">  - Distal RBS Band: Batas bawah absolut support (titik jangkar Invalidation SL mutlak).</w:t>
-        <w:br/>
-        <w:t>• Untuk Peluang SELL (Supply Driven):</w:t>
-        <w:br/>
-        <w:t xml:space="preserve">  - SBR (Support-Become-Resistance): Mengincar retest di zona SBR yang telah ditembus sebelumnya.</w:t>
-        <w:br/>
-        <w:t xml:space="preserve">  - Proximal SBR Band: Batas bawah zona resistance (titik entri Sell Limit paling efisien).</w:t>
-        <w:br/>
-        <w:t xml:space="preserve">  - Distal SBR Band: Batas atas absolut resistance (titik jangkar Invalidation SL mutlak).</w:t>
-      </w:r>
-    </w:p>
-    <w:p>
-      <w:pPr>
-        <w:pStyle w:val="Heading1"/>
-        <w:keepNext/>
-        <w:spacing w:before="360" w:after="120"/>
-      </w:pPr>
-      <w:r>
-        <w:rPr>
-          <w:b/>
-          <w:color w:val="0F172A"/>
-          <w:sz w:val="30"/>
-        </w:rPr>
-        <w:t>Bab 7: LuxAlgo SMC, Liquidity Map &amp; FRVP Confluence</w:t>
-      </w:r>
-    </w:p>
-    <w:p>
-      <w:r>
-        <w:t>Penerapan SMC dan FRVP secara simetris:</w:t>
-      </w:r>
-    </w:p>
-    <w:p>
-      <w:r>
-        <w:t>1. Order Block (OB): Bullish OB (Unmitigated Demand di H4/H1) untuk jangkar BUY; Bearish OB (Unmitigated Supply di H4/H1) untuk jangkar SELL.</w:t>
-        <w:br/>
-        <w:t>2. Fair Value Gap (FVG): Bullish FVG sebagai magnet target TP pada posisi BUY; Bearish FVG sebagai magnet target TP pada posisi SELL.</w:t>
-        <w:br/>
-        <w:t>3. Liquidity Pools (EQH/EQL): Menghindari BUY tepat di bawah Equal Highs (potensi reversal); Menghindari SELL tepat di atas Equal Lows (potensi bounce).</w:t>
-        <w:br/>
-        <w:t>4. FRVP Confluence: Value Area Low (VAL) untuk entri diskon BUY; Value Area High (VAH) untuk entri premium SELL.</w:t>
-      </w:r>
-    </w:p>
-    <w:p>
-      <w:pPr>
-        <w:pStyle w:val="Heading1"/>
-        <w:keepNext/>
-        <w:spacing w:before="360" w:after="120"/>
-      </w:pPr>
-      <w:r>
-        <w:rPr>
-          <w:b/>
-          <w:color w:val="0F172A"/>
-          <w:sz w:val="30"/>
-        </w:rPr>
-        <w:t>Bab 8: Stage 2 Multi-LLM Consensus Jury &amp; 2-Pass Audit Protocol</w:t>
-      </w:r>
-    </w:p>
-    <w:p>
-      <w:r>
-        <w:t>Sidang juri 3-LLM mengevaluasi proposal secara obyektif tanpa bias arah:</w:t>
+        <w:t>Bab 8: Stage 2 Multi-LLM Consensus Jury &amp; Strict 3/3 Protocol</w:t>
       </w:r>
     </w:p>
     <w:tbl>
@@ -3894,7 +2167,7 @@
                 <w:color w:val="0F172A"/>
                 <w:sz w:val="20"/>
               </w:rPr>
-              <w:t>📌 11 Bendera Hard Risk Veto (Simetris BUY &amp; SELL)</w:t>
+              <w:t>📌 Protokol Konsensus Definitif (Strict Unanimous 3/3)</w:t>
               <w:br/>
             </w:r>
             <w:r>
@@ -3902,17 +2175,24 @@
                 <w:color w:val="1E293B"/>
                 <w:sz w:val="19"/>
               </w:rPr>
-              <w:t>1. COUNTER_TREND_MOMENTUM: Veto BUY jika melawan lilin hijau besar; Veto SELL jika melawan lilin merah besar.</w:t>
+              <w:t>1. Syarat Eksekusi Mutlak (Zero Tolerance Split):</w:t>
               <w:br/>
-              <w:t>2. FALLING_KNIFE_WATERFALL: Veto BUY jika lilin M5 merah beruntun tanpa sumbu bawah; Veto SELL jika lilin M5 hijau beruntun tanpa sumbu atas.</w:t>
+              <w:t xml:space="preserve">   - Wajib 3 dari 3 model aktif (OpenAI o4-mini, Gemini 3.1-Flash, DeepSeek V4-Flash) memilih arah yang sama persis (3/3 BUY atau 3/3 SELL).</w:t>
               <w:br/>
-              <w:t>3. SYSTEMIC_CURRENCY_DUMP: Veto BUY jika base currency dumping; Veto SELL jika quote currency dumping.</w:t>
+              <w:t xml:space="preserve">   - Jika ada 1 model yang memilih HOLD, REJECT, atau arah berlawanan (hasil 2/3 atau split vote) -&gt; OTOMATIS DIBATALKAN (HOLD).</w:t>
               <w:br/>
-              <w:t>4. UNMITIGATED_IMPULSE_CHASE: Veto jika harga sudah berlari &gt; 1.5x ATR dari zona diskon/premium.</w:t>
+              <w:t xml:space="preserve">   - Sistem Weighted-Confidence 1.20 lama sudah di-DROP 100% dari consensus.py demi mencegah entri ragu-ragu.</w:t>
               <w:br/>
-              <w:t>5. HIGH_IMPACT_NEWS: Veto mutlak kedua arah dalam jendela +/- 6 jam berita berdampak tinggi.</w:t>
               <w:br/>
-              <w:t>6. SPREAD_SPIKE, LIQUIDITY_TRAP, INSTANT_RETEST, NEAR_EQH_EQL, ROLLOVER_WINDOW, NONE.</w:t>
+              <w:t>2. Eksekusi Unanimous 3/3 High Confidence Split (+25% Boost):</w:t>
+              <w:br/>
+              <w:t xml:space="preserve">   - Jika ketiga model sepakat bulat dan rata-rata Confidence &gt;= 75% serta terdapat &gt;= 2 slot MT5 kosong:</w:t>
+              <w:br/>
+              <w:t xml:space="preserve">   - Bot membuka 2 tiket posisi sekaligus @ 0.625x Base Lot (Total 1.25x bobot):</w:t>
+              <w:br/>
+              <w:t xml:space="preserve">     * Posisi #1: Menargetkan TP1 Standar (Stasiun terdekat) dengan trailing stop agresif.</w:t>
+              <w:br/>
+              <w:t xml:space="preserve">     * Posisi #2: Menargetkan TP2 Extended Target (Stasiun makro besar) dengan trailing swing bernafas.</w:t>
             </w:r>
           </w:p>
         </w:tc>
@@ -3922,1425 +2202,6 @@
       <w:pPr>
         <w:spacing w:before="0" w:after="80"/>
       </w:pPr>
-    </w:p>
-    <w:p>
-      <w:r>
-        <w:t>Unanimous 3/3 High Confidence Split (+25% Boost):</w:t>
-      </w:r>
-    </w:p>
-    <w:p>
-      <w:r>
-        <w:t>Jika ketiga model (OpenAI, Gemini, DeepSeek) sepakat bulat searah (BUY atau SELL) dengan Confidence &gt;= 75%, bot membuka 2 tiket posisi @ 0.625 lot (Total 1.25x base lot):</w:t>
-        <w:br/>
-        <w:t>• Posisi #1: Menargetkan TP1 Standar (Stasiun terdekat) dengan trailing stop agresif.</w:t>
-        <w:br/>
-        <w:t>• Posisi #2: Menargetkan TP2 Extended Target (Stasiun makro besar) dengan trailing swing bernafas.</w:t>
-      </w:r>
-    </w:p>
-    <w:p>
-      <w:pPr>
-        <w:pStyle w:val="Heading1"/>
-        <w:keepNext/>
-        <w:spacing w:before="360" w:after="120"/>
-      </w:pPr>
-      <w:r>
-        <w:rPr>
-          <w:b/>
-          <w:color w:val="0F172A"/>
-          <w:sz w:val="30"/>
-        </w:rPr>
-        <w:t>Bab 9: Risk Engine &amp; Account Safeguards (risk_engine.py)</w:t>
-      </w:r>
-    </w:p>
-    <w:tbl>
-      <w:tblPr>
-        <w:tblW w:type="auto" w:w="0"/>
-        <w:jc w:val="center"/>
-        <w:tblLayout w:type="fixed"/>
-        <w:tblLook w:firstColumn="1" w:firstRow="1" w:lastColumn="0" w:lastRow="0" w:noHBand="0" w:noVBand="1" w:val="04A0"/>
-      </w:tblPr>
-      <w:tblGrid>
-        <w:gridCol w:w="9648"/>
-      </w:tblGrid>
-      <w:tr>
-        <w:tc>
-          <w:tcPr>
-            <w:tcW w:type="dxa" w:w="9936"/>
-            <w:shd w:fill="0f172a"/>
-            <w:tcMar>
-              <w:top w:w="140" w:type="dxa"/>
-              <w:bottom w:w="140" w:type="dxa"/>
-              <w:left w:w="180" w:type="dxa"/>
-              <w:right w:w="180" w:type="dxa"/>
-            </w:tcMar>
-          </w:tcPr>
-          <w:p>
-            <w:pPr>
-              <w:spacing w:after="0" w:line="276" w:lineRule="auto"/>
-            </w:pPr>
-            <w:r>
-              <w:rPr>
-                <w:rFonts w:ascii="Consolas" w:hAnsi="Consolas"/>
-                <w:color w:val="E2E8F0"/>
-                <w:sz w:val="17"/>
-              </w:rPr>
-              <w:t>// Rumus Dinamis Ukuran Lot Berbasis Risiko</w:t>
-              <w:br/>
-              <w:t>Lot_Size = (Account_Equity * Risk_Percent) / (SL_Points * USD_Per_Point)</w:t>
-              <w:br/>
-              <w:br/>
-              <w:t>// Contoh Perhitungan Simetris pada Akun $5,818 (Risk 1.0% = $58.18):</w:t>
-              <w:br/>
-              <w:t>// Skenario BUY  GBPUSD: Entry 1.3580, SL 1.3567 (130 pts) -&gt; Lot = 0.44 Lot</w:t>
-              <w:br/>
-              <w:t>// Skenario SELL GBPUSD: Entry 1.3620, SL 1.3633 (130 pts) -&gt; Lot = 0.44 Lot</w:t>
-            </w:r>
-          </w:p>
-        </w:tc>
-      </w:tr>
-    </w:tbl>
-    <w:p>
-      <w:pPr>
-        <w:spacing w:before="0" w:after="80"/>
-      </w:pPr>
-    </w:p>
-    <w:p>
-      <w:r>
-        <w:t>Aturan Pengaman Akun:</w:t>
-        <w:br/>
-        <w:t>• Max Daily Loss: 4.0% Equity (Cut trading otomatis jika rugi harian menyentuh 4%).</w:t>
-        <w:br/>
-        <w:t>• Daily Profit Target: 6.0% Equity (Kunci profit harian untuk mencegah overtrading).</w:t>
-        <w:br/>
-        <w:t>• Max Open Positions: 6 posisi aktif + 4 pending limit order (shared pool).</w:t>
-        <w:br/>
-        <w:t>• Recovery Mode: Terpicu jika 5 loss beruntun -&gt; Lot dipangkas x0.5 dan max posisi dibatasi 3.</w:t>
-      </w:r>
-    </w:p>
-    <w:p>
-      <w:pPr>
-        <w:pStyle w:val="Heading1"/>
-        <w:keepNext/>
-        <w:spacing w:before="360" w:after="120"/>
-      </w:pPr>
-      <w:r>
-        <w:rPr>
-          <w:b/>
-          <w:color w:val="0F172A"/>
-          <w:sz w:val="30"/>
-        </w:rPr>
-        <w:t>Bab 10: Real-Time Position Management Lifecycle (position_manager.py)</w:t>
-      </w:r>
-    </w:p>
-    <w:p>
-      <w:r>
-        <w:t>Pemantauan posisi berjalan real-time setiap 3 detik dengan formula simetris:</w:t>
-      </w:r>
-    </w:p>
-    <w:tbl>
-      <w:tblPr>
-        <w:tblW w:type="auto" w:w="0"/>
-        <w:jc w:val="center"/>
-        <w:tblLayout w:type="fixed"/>
-        <w:tblLook w:firstColumn="1" w:firstRow="1" w:lastColumn="0" w:lastRow="0" w:noHBand="0" w:noVBand="1" w:val="04A0"/>
-      </w:tblPr>
-      <w:tblGrid>
-        <w:gridCol w:w="3312"/>
-        <w:gridCol w:w="3312"/>
-        <w:gridCol w:w="3312"/>
-      </w:tblGrid>
-      <w:tr>
-        <w:tc>
-          <w:tcPr>
-            <w:tcW w:type="dxa" w:w="2592"/>
-            <w:shd w:fill="0f172a"/>
-            <w:tcMar>
-              <w:top w:w="120" w:type="dxa"/>
-              <w:bottom w:w="120" w:type="dxa"/>
-              <w:left w:w="120" w:type="dxa"/>
-              <w:right w:w="120" w:type="dxa"/>
-            </w:tcMar>
-          </w:tcPr>
-          <w:p>
-            <w:pPr>
-              <w:spacing w:after="0"/>
-            </w:pPr>
-            <w:r>
-              <w:rPr>
-                <w:b/>
-                <w:color w:val="FFFFFF"/>
-                <w:sz w:val="18"/>
-              </w:rPr>
-              <w:t>Fitur Proteksi</w:t>
-            </w:r>
-          </w:p>
-        </w:tc>
-        <w:tc>
-          <w:tcPr>
-            <w:tcW w:type="dxa" w:w="3456"/>
-            <w:shd w:fill="0f172a"/>
-            <w:tcMar>
-              <w:top w:w="120" w:type="dxa"/>
-              <w:bottom w:w="120" w:type="dxa"/>
-              <w:left w:w="120" w:type="dxa"/>
-              <w:right w:w="120" w:type="dxa"/>
-            </w:tcMar>
-          </w:tcPr>
-          <w:p>
-            <w:pPr>
-              <w:spacing w:after="0"/>
-            </w:pPr>
-            <w:r>
-              <w:rPr>
-                <w:b/>
-                <w:color w:val="FFFFFF"/>
-                <w:sz w:val="18"/>
-              </w:rPr>
-              <w:t>Aksi pada Posisi BUY (Long)</w:t>
-            </w:r>
-          </w:p>
-        </w:tc>
-        <w:tc>
-          <w:tcPr>
-            <w:tcW w:type="dxa" w:w="3600"/>
-            <w:shd w:fill="0f172a"/>
-            <w:tcMar>
-              <w:top w:w="120" w:type="dxa"/>
-              <w:bottom w:w="120" w:type="dxa"/>
-              <w:left w:w="120" w:type="dxa"/>
-              <w:right w:w="120" w:type="dxa"/>
-            </w:tcMar>
-          </w:tcPr>
-          <w:p>
-            <w:pPr>
-              <w:spacing w:after="0"/>
-            </w:pPr>
-            <w:r>
-              <w:rPr>
-                <w:b/>
-                <w:color w:val="FFFFFF"/>
-                <w:sz w:val="18"/>
-              </w:rPr>
-              <w:t>Aksi pada Posisi SELL (Short)</w:t>
-            </w:r>
-          </w:p>
-        </w:tc>
-      </w:tr>
-      <w:tr>
-        <w:tc>
-          <w:tcPr>
-            <w:tcW w:type="dxa" w:w="2592"/>
-            <w:shd w:fill="ffffff"/>
-            <w:tcMar>
-              <w:top w:w="100" w:type="dxa"/>
-              <w:bottom w:w="100" w:type="dxa"/>
-              <w:left w:w="120" w:type="dxa"/>
-              <w:right w:w="120" w:type="dxa"/>
-            </w:tcMar>
-          </w:tcPr>
-          <w:p>
-            <w:pPr>
-              <w:spacing w:after="0"/>
-            </w:pPr>
-            <w:r>
-              <w:rPr>
-                <w:color w:val="1E293B"/>
-                <w:sz w:val="17"/>
-              </w:rPr>
-              <w:t>Pocket Profit BEP (45-55% TP)</w:t>
-            </w:r>
-          </w:p>
-        </w:tc>
-        <w:tc>
-          <w:tcPr>
-            <w:tcW w:type="dxa" w:w="3456"/>
-            <w:shd w:fill="ffffff"/>
-            <w:tcMar>
-              <w:top w:w="100" w:type="dxa"/>
-              <w:bottom w:w="100" w:type="dxa"/>
-              <w:left w:w="120" w:type="dxa"/>
-              <w:right w:w="120" w:type="dxa"/>
-            </w:tcMar>
-          </w:tcPr>
-          <w:p>
-            <w:pPr>
-              <w:spacing w:after="0"/>
-            </w:pPr>
-            <w:r>
-              <w:rPr>
-                <w:color w:val="1E293B"/>
-                <w:sz w:val="17"/>
-              </w:rPr>
-              <w:t>SL dinaikkan ke: Entry + Komisi + 15 pts (1.5 pips).</w:t>
-            </w:r>
-          </w:p>
-        </w:tc>
-        <w:tc>
-          <w:tcPr>
-            <w:tcW w:type="dxa" w:w="3600"/>
-            <w:shd w:fill="ffffff"/>
-            <w:tcMar>
-              <w:top w:w="100" w:type="dxa"/>
-              <w:bottom w:w="100" w:type="dxa"/>
-              <w:left w:w="120" w:type="dxa"/>
-              <w:right w:w="120" w:type="dxa"/>
-            </w:tcMar>
-          </w:tcPr>
-          <w:p>
-            <w:pPr>
-              <w:spacing w:after="0"/>
-            </w:pPr>
-            <w:r>
-              <w:rPr>
-                <w:color w:val="1E293B"/>
-                <w:sz w:val="17"/>
-              </w:rPr>
-              <w:t>SL diturunkan ke: Entry - Komisi - 15 pts (1.5 pips).</w:t>
-            </w:r>
-          </w:p>
-        </w:tc>
-      </w:tr>
-      <w:tr>
-        <w:tc>
-          <w:tcPr>
-            <w:tcW w:type="dxa" w:w="2592"/>
-            <w:shd w:fill="f8fafc"/>
-            <w:tcMar>
-              <w:top w:w="100" w:type="dxa"/>
-              <w:bottom w:w="100" w:type="dxa"/>
-              <w:left w:w="120" w:type="dxa"/>
-              <w:right w:w="120" w:type="dxa"/>
-            </w:tcMar>
-          </w:tcPr>
-          <w:p>
-            <w:pPr>
-              <w:spacing w:after="0"/>
-            </w:pPr>
-            <w:r>
-              <w:rPr>
-                <w:color w:val="1E293B"/>
-                <w:sz w:val="17"/>
-              </w:rPr>
-              <w:t>Partial Close (TP1)</w:t>
-            </w:r>
-          </w:p>
-        </w:tc>
-        <w:tc>
-          <w:tcPr>
-            <w:tcW w:type="dxa" w:w="3456"/>
-            <w:shd w:fill="f8fafc"/>
-            <w:tcMar>
-              <w:top w:w="100" w:type="dxa"/>
-              <w:bottom w:w="100" w:type="dxa"/>
-              <w:left w:w="120" w:type="dxa"/>
-              <w:right w:w="120" w:type="dxa"/>
-            </w:tcMar>
-          </w:tcPr>
-          <w:p>
-            <w:pPr>
-              <w:spacing w:after="0"/>
-            </w:pPr>
-            <w:r>
-              <w:rPr>
-                <w:color w:val="1E293B"/>
-                <w:sz w:val="17"/>
-              </w:rPr>
-              <w:t>Cairkan 50% lot saat harga mencapai 50% jarak TP.</w:t>
-            </w:r>
-          </w:p>
-        </w:tc>
-        <w:tc>
-          <w:tcPr>
-            <w:tcW w:type="dxa" w:w="3600"/>
-            <w:shd w:fill="f8fafc"/>
-            <w:tcMar>
-              <w:top w:w="100" w:type="dxa"/>
-              <w:bottom w:w="100" w:type="dxa"/>
-              <w:left w:w="120" w:type="dxa"/>
-              <w:right w:w="120" w:type="dxa"/>
-            </w:tcMar>
-          </w:tcPr>
-          <w:p>
-            <w:pPr>
-              <w:spacing w:after="0"/>
-            </w:pPr>
-            <w:r>
-              <w:rPr>
-                <w:color w:val="1E293B"/>
-                <w:sz w:val="17"/>
-              </w:rPr>
-              <w:t>Cairkan 50% lot saat harga mencapai 50% jarak TP.</w:t>
-            </w:r>
-          </w:p>
-        </w:tc>
-      </w:tr>
-      <w:tr>
-        <w:tc>
-          <w:tcPr>
-            <w:tcW w:type="dxa" w:w="2592"/>
-            <w:shd w:fill="ffffff"/>
-            <w:tcMar>
-              <w:top w:w="100" w:type="dxa"/>
-              <w:bottom w:w="100" w:type="dxa"/>
-              <w:left w:w="120" w:type="dxa"/>
-              <w:right w:w="120" w:type="dxa"/>
-            </w:tcMar>
-          </w:tcPr>
-          <w:p>
-            <w:pPr>
-              <w:spacing w:after="0"/>
-            </w:pPr>
-            <w:r>
-              <w:rPr>
-                <w:color w:val="1E293B"/>
-                <w:sz w:val="17"/>
-              </w:rPr>
-              <w:t>Trailing Stage 1 (65-90% TP)</w:t>
-            </w:r>
-          </w:p>
-        </w:tc>
-        <w:tc>
-          <w:tcPr>
-            <w:tcW w:type="dxa" w:w="3456"/>
-            <w:shd w:fill="ffffff"/>
-            <w:tcMar>
-              <w:top w:w="100" w:type="dxa"/>
-              <w:bottom w:w="100" w:type="dxa"/>
-              <w:left w:w="120" w:type="dxa"/>
-              <w:right w:w="120" w:type="dxa"/>
-            </w:tcMar>
-          </w:tcPr>
-          <w:p>
-            <w:pPr>
-              <w:spacing w:after="0"/>
-            </w:pPr>
-            <w:r>
-              <w:rPr>
-                <w:color w:val="1E293B"/>
-                <w:sz w:val="17"/>
-              </w:rPr>
-              <w:t>SL mengikuti di bawah harga tertinggi sebesar 0.75x ATR H1.</w:t>
-            </w:r>
-          </w:p>
-        </w:tc>
-        <w:tc>
-          <w:tcPr>
-            <w:tcW w:type="dxa" w:w="3600"/>
-            <w:shd w:fill="ffffff"/>
-            <w:tcMar>
-              <w:top w:w="100" w:type="dxa"/>
-              <w:bottom w:w="100" w:type="dxa"/>
-              <w:left w:w="120" w:type="dxa"/>
-              <w:right w:w="120" w:type="dxa"/>
-            </w:tcMar>
-          </w:tcPr>
-          <w:p>
-            <w:pPr>
-              <w:spacing w:after="0"/>
-            </w:pPr>
-            <w:r>
-              <w:rPr>
-                <w:color w:val="1E293B"/>
-                <w:sz w:val="17"/>
-              </w:rPr>
-              <w:t>SL mengikuti di atas harga terendah sebesar 0.75x ATR H1.</w:t>
-            </w:r>
-          </w:p>
-        </w:tc>
-      </w:tr>
-      <w:tr>
-        <w:tc>
-          <w:tcPr>
-            <w:tcW w:type="dxa" w:w="2592"/>
-            <w:shd w:fill="f8fafc"/>
-            <w:tcMar>
-              <w:top w:w="100" w:type="dxa"/>
-              <w:bottom w:w="100" w:type="dxa"/>
-              <w:left w:w="120" w:type="dxa"/>
-              <w:right w:w="120" w:type="dxa"/>
-            </w:tcMar>
-          </w:tcPr>
-          <w:p>
-            <w:pPr>
-              <w:spacing w:after="0"/>
-            </w:pPr>
-            <w:r>
-              <w:rPr>
-                <w:color w:val="1E293B"/>
-                <w:sz w:val="17"/>
-              </w:rPr>
-              <w:t>Trailing Stage 2 (&gt;= 90% TP)</w:t>
-            </w:r>
-          </w:p>
-        </w:tc>
-        <w:tc>
-          <w:tcPr>
-            <w:tcW w:type="dxa" w:w="3456"/>
-            <w:shd w:fill="f8fafc"/>
-            <w:tcMar>
-              <w:top w:w="100" w:type="dxa"/>
-              <w:bottom w:w="100" w:type="dxa"/>
-              <w:left w:w="120" w:type="dxa"/>
-              <w:right w:w="120" w:type="dxa"/>
-            </w:tcMar>
-          </w:tcPr>
-          <w:p>
-            <w:pPr>
-              <w:spacing w:after="0"/>
-            </w:pPr>
-            <w:r>
-              <w:rPr>
-                <w:color w:val="1E293B"/>
-                <w:sz w:val="17"/>
-              </w:rPr>
-              <w:t>Kunci profit ketat di bawah harga sebesar 0.50x ATR M30.</w:t>
-            </w:r>
-          </w:p>
-        </w:tc>
-        <w:tc>
-          <w:tcPr>
-            <w:tcW w:type="dxa" w:w="3600"/>
-            <w:shd w:fill="f8fafc"/>
-            <w:tcMar>
-              <w:top w:w="100" w:type="dxa"/>
-              <w:bottom w:w="100" w:type="dxa"/>
-              <w:left w:w="120" w:type="dxa"/>
-              <w:right w:w="120" w:type="dxa"/>
-            </w:tcMar>
-          </w:tcPr>
-          <w:p>
-            <w:pPr>
-              <w:spacing w:after="0"/>
-            </w:pPr>
-            <w:r>
-              <w:rPr>
-                <w:color w:val="1E293B"/>
-                <w:sz w:val="17"/>
-              </w:rPr>
-              <w:t>Kunci profit ketat di atas harga sebesar 0.50x ATR M30.</w:t>
-            </w:r>
-          </w:p>
-        </w:tc>
-      </w:tr>
-      <w:tr>
-        <w:tc>
-          <w:tcPr>
-            <w:tcW w:type="dxa" w:w="2592"/>
-            <w:shd w:fill="ffffff"/>
-            <w:tcMar>
-              <w:top w:w="100" w:type="dxa"/>
-              <w:bottom w:w="100" w:type="dxa"/>
-              <w:left w:w="120" w:type="dxa"/>
-              <w:right w:w="120" w:type="dxa"/>
-            </w:tcMar>
-          </w:tcPr>
-          <w:p>
-            <w:pPr>
-              <w:spacing w:after="0"/>
-            </w:pPr>
-            <w:r>
-              <w:rPr>
-                <w:color w:val="1E293B"/>
-                <w:sz w:val="17"/>
-              </w:rPr>
-              <w:t>Time-Decay Stagnation Exit</w:t>
-            </w:r>
-          </w:p>
-        </w:tc>
-        <w:tc>
-          <w:tcPr>
-            <w:tcW w:type="dxa" w:w="3456"/>
-            <w:shd w:fill="ffffff"/>
-            <w:tcMar>
-              <w:top w:w="100" w:type="dxa"/>
-              <w:bottom w:w="100" w:type="dxa"/>
-              <w:left w:w="120" w:type="dxa"/>
-              <w:right w:w="120" w:type="dxa"/>
-            </w:tcMar>
-          </w:tcPr>
-          <w:p>
-            <w:pPr>
-              <w:spacing w:after="0"/>
-            </w:pPr>
-            <w:r>
-              <w:rPr>
-                <w:color w:val="1E293B"/>
-                <w:sz w:val="17"/>
-              </w:rPr>
-              <w:t>Tutup otomatis jika &gt;= 4 jam di [-0.2R, +0.2R] &amp; Peak &lt; +0.3R.</w:t>
-            </w:r>
-          </w:p>
-        </w:tc>
-        <w:tc>
-          <w:tcPr>
-            <w:tcW w:type="dxa" w:w="3600"/>
-            <w:shd w:fill="ffffff"/>
-            <w:tcMar>
-              <w:top w:w="100" w:type="dxa"/>
-              <w:bottom w:w="100" w:type="dxa"/>
-              <w:left w:w="120" w:type="dxa"/>
-              <w:right w:w="120" w:type="dxa"/>
-            </w:tcMar>
-          </w:tcPr>
-          <w:p>
-            <w:pPr>
-              <w:spacing w:after="0"/>
-            </w:pPr>
-            <w:r>
-              <w:rPr>
-                <w:color w:val="1E293B"/>
-                <w:sz w:val="17"/>
-              </w:rPr>
-              <w:t>Tutup otomatis jika &gt;= 4 jam di [-0.2R, +0.2R] &amp; Peak &lt; +0.3R.</w:t>
-            </w:r>
-          </w:p>
-        </w:tc>
-      </w:tr>
-      <w:tr>
-        <w:tc>
-          <w:tcPr>
-            <w:tcW w:type="dxa" w:w="2592"/>
-            <w:shd w:fill="f8fafc"/>
-            <w:tcMar>
-              <w:top w:w="100" w:type="dxa"/>
-              <w:bottom w:w="100" w:type="dxa"/>
-              <w:left w:w="120" w:type="dxa"/>
-              <w:right w:w="120" w:type="dxa"/>
-            </w:tcMar>
-          </w:tcPr>
-          <w:p>
-            <w:pPr>
-              <w:spacing w:after="0"/>
-            </w:pPr>
-            <w:r>
-              <w:rPr>
-                <w:color w:val="1E293B"/>
-                <w:sz w:val="17"/>
-              </w:rPr>
-              <w:t>Pre-Rollover Shield (03:50 WIB)</w:t>
-            </w:r>
-          </w:p>
-        </w:tc>
-        <w:tc>
-          <w:tcPr>
-            <w:tcW w:type="dxa" w:w="3456"/>
-            <w:shd w:fill="f8fafc"/>
-            <w:tcMar>
-              <w:top w:w="100" w:type="dxa"/>
-              <w:bottom w:w="100" w:type="dxa"/>
-              <w:left w:w="120" w:type="dxa"/>
-              <w:right w:w="120" w:type="dxa"/>
-            </w:tcMar>
-          </w:tcPr>
-          <w:p>
-            <w:pPr>
-              <w:spacing w:after="0"/>
-            </w:pPr>
-            <w:r>
-              <w:rPr>
-                <w:color w:val="1E293B"/>
-                <w:sz w:val="17"/>
-              </w:rPr>
-              <w:t>Tutup otomatis jika jarak ke SL &lt;= threshold per pair.</w:t>
-            </w:r>
-          </w:p>
-        </w:tc>
-        <w:tc>
-          <w:tcPr>
-            <w:tcW w:type="dxa" w:w="3600"/>
-            <w:shd w:fill="f8fafc"/>
-            <w:tcMar>
-              <w:top w:w="100" w:type="dxa"/>
-              <w:bottom w:w="100" w:type="dxa"/>
-              <w:left w:w="120" w:type="dxa"/>
-              <w:right w:w="120" w:type="dxa"/>
-            </w:tcMar>
-          </w:tcPr>
-          <w:p>
-            <w:pPr>
-              <w:spacing w:after="0"/>
-            </w:pPr>
-            <w:r>
-              <w:rPr>
-                <w:color w:val="1E293B"/>
-                <w:sz w:val="17"/>
-              </w:rPr>
-              <w:t>Tutup otomatis jika jarak ke SL &lt;= threshold per pair.</w:t>
-            </w:r>
-          </w:p>
-        </w:tc>
-      </w:tr>
-    </w:tbl>
-    <w:p>
-      <w:pPr>
-        <w:spacing w:after="120"/>
-      </w:pPr>
-    </w:p>
-    <w:p>
-      <w:pPr>
-        <w:pStyle w:val="Heading1"/>
-        <w:keepNext/>
-        <w:spacing w:before="360" w:after="120"/>
-      </w:pPr>
-      <w:r>
-        <w:rPr>
-          <w:b/>
-          <w:color w:val="0F172A"/>
-          <w:sz w:val="30"/>
-        </w:rPr>
-        <w:t>Bab 11: Comprehensive Tokenomics, Latency &amp; Cost Optimization</w:t>
-      </w:r>
-    </w:p>
-    <w:p>
-      <w:r>
-        <w:t>Analisis komparatif kuantitatif konsumsi token dan biaya operasional API:</w:t>
-      </w:r>
-    </w:p>
-    <w:tbl>
-      <w:tblPr>
-        <w:tblW w:type="auto" w:w="0"/>
-        <w:jc w:val="center"/>
-        <w:tblLayout w:type="fixed"/>
-        <w:tblLook w:firstColumn="1" w:firstRow="1" w:lastColumn="0" w:lastRow="0" w:noHBand="0" w:noVBand="1" w:val="04A0"/>
-      </w:tblPr>
-      <w:tblGrid>
-        <w:gridCol w:w="2484"/>
-        <w:gridCol w:w="2484"/>
-        <w:gridCol w:w="2484"/>
-        <w:gridCol w:w="2484"/>
-      </w:tblGrid>
-      <w:tr>
-        <w:tc>
-          <w:tcPr>
-            <w:tcW w:type="dxa" w:w="2880"/>
-            <w:shd w:fill="0f172a"/>
-            <w:tcMar>
-              <w:top w:w="120" w:type="dxa"/>
-              <w:bottom w:w="120" w:type="dxa"/>
-              <w:left w:w="120" w:type="dxa"/>
-              <w:right w:w="120" w:type="dxa"/>
-            </w:tcMar>
-          </w:tcPr>
-          <w:p>
-            <w:pPr>
-              <w:spacing w:after="0"/>
-            </w:pPr>
-            <w:r>
-              <w:rPr>
-                <w:b/>
-                <w:color w:val="FFFFFF"/>
-                <w:sz w:val="18"/>
-              </w:rPr>
-              <w:t>Komponen Arsitektur</w:t>
-            </w:r>
-          </w:p>
-        </w:tc>
-        <w:tc>
-          <w:tcPr>
-            <w:tcW w:type="dxa" w:w="2160"/>
-            <w:shd w:fill="0f172a"/>
-            <w:tcMar>
-              <w:top w:w="120" w:type="dxa"/>
-              <w:bottom w:w="120" w:type="dxa"/>
-              <w:left w:w="120" w:type="dxa"/>
-              <w:right w:w="120" w:type="dxa"/>
-            </w:tcMar>
-          </w:tcPr>
-          <w:p>
-            <w:pPr>
-              <w:spacing w:after="0"/>
-            </w:pPr>
-            <w:r>
-              <w:rPr>
-                <w:b/>
-                <w:color w:val="FFFFFF"/>
-                <w:sz w:val="18"/>
-              </w:rPr>
-              <w:t>Metode Polling Lama (M5)</w:t>
-            </w:r>
-          </w:p>
-        </w:tc>
-        <w:tc>
-          <w:tcPr>
-            <w:tcW w:type="dxa" w:w="2304"/>
-            <w:shd w:fill="0f172a"/>
-            <w:tcMar>
-              <w:top w:w="120" w:type="dxa"/>
-              <w:bottom w:w="120" w:type="dxa"/>
-              <w:left w:w="120" w:type="dxa"/>
-              <w:right w:w="120" w:type="dxa"/>
-            </w:tcMar>
-          </w:tcPr>
-          <w:p>
-            <w:pPr>
-              <w:spacing w:after="0"/>
-            </w:pPr>
-            <w:r>
-              <w:rPr>
-                <w:b/>
-                <w:color w:val="FFFFFF"/>
-                <w:sz w:val="18"/>
-              </w:rPr>
-              <w:t>2-Stage Quant Funnel (Baru)</w:t>
-            </w:r>
-          </w:p>
-        </w:tc>
-        <w:tc>
-          <w:tcPr>
-            <w:tcW w:type="dxa" w:w="2304"/>
-            <w:shd w:fill="0f172a"/>
-            <w:tcMar>
-              <w:top w:w="120" w:type="dxa"/>
-              <w:bottom w:w="120" w:type="dxa"/>
-              <w:left w:w="120" w:type="dxa"/>
-              <w:right w:w="120" w:type="dxa"/>
-            </w:tcMar>
-          </w:tcPr>
-          <w:p>
-            <w:pPr>
-              <w:spacing w:after="0"/>
-            </w:pPr>
-            <w:r>
-              <w:rPr>
-                <w:b/>
-                <w:color w:val="FFFFFF"/>
-                <w:sz w:val="18"/>
-              </w:rPr>
-              <w:t>Efisiensi Penghematan</w:t>
-            </w:r>
-          </w:p>
-        </w:tc>
-      </w:tr>
-      <w:tr>
-        <w:tc>
-          <w:tcPr>
-            <w:tcW w:type="dxa" w:w="2880"/>
-            <w:shd w:fill="ffffff"/>
-            <w:tcMar>
-              <w:top w:w="100" w:type="dxa"/>
-              <w:bottom w:w="100" w:type="dxa"/>
-              <w:left w:w="120" w:type="dxa"/>
-              <w:right w:w="120" w:type="dxa"/>
-            </w:tcMar>
-          </w:tcPr>
-          <w:p>
-            <w:pPr>
-              <w:spacing w:after="0"/>
-            </w:pPr>
-            <w:r>
-              <w:rPr>
-                <w:color w:val="1E293B"/>
-                <w:sz w:val="17"/>
-              </w:rPr>
-              <w:t>Frekuensi Pemindaian</w:t>
-            </w:r>
-          </w:p>
-        </w:tc>
-        <w:tc>
-          <w:tcPr>
-            <w:tcW w:type="dxa" w:w="2160"/>
-            <w:shd w:fill="ffffff"/>
-            <w:tcMar>
-              <w:top w:w="100" w:type="dxa"/>
-              <w:bottom w:w="100" w:type="dxa"/>
-              <w:left w:w="120" w:type="dxa"/>
-              <w:right w:w="120" w:type="dxa"/>
-            </w:tcMar>
-          </w:tcPr>
-          <w:p>
-            <w:pPr>
-              <w:spacing w:after="0"/>
-            </w:pPr>
-            <w:r>
-              <w:rPr>
-                <w:color w:val="1E293B"/>
-                <w:sz w:val="17"/>
-              </w:rPr>
-              <w:t>7.776 Siklus / Hari</w:t>
-            </w:r>
-          </w:p>
-        </w:tc>
-        <w:tc>
-          <w:tcPr>
-            <w:tcW w:type="dxa" w:w="2304"/>
-            <w:shd w:fill="ffffff"/>
-            <w:tcMar>
-              <w:top w:w="100" w:type="dxa"/>
-              <w:bottom w:w="100" w:type="dxa"/>
-              <w:left w:w="120" w:type="dxa"/>
-              <w:right w:w="120" w:type="dxa"/>
-            </w:tcMar>
-          </w:tcPr>
-          <w:p>
-            <w:pPr>
-              <w:spacing w:after="0"/>
-            </w:pPr>
-            <w:r>
-              <w:rPr>
-                <w:color w:val="1E293B"/>
-                <w:sz w:val="17"/>
-              </w:rPr>
-              <w:t>1.440 Siklus Radar / Hari</w:t>
-            </w:r>
-          </w:p>
-        </w:tc>
-        <w:tc>
-          <w:tcPr>
-            <w:tcW w:type="dxa" w:w="2304"/>
-            <w:shd w:fill="ffffff"/>
-            <w:tcMar>
-              <w:top w:w="100" w:type="dxa"/>
-              <w:bottom w:w="100" w:type="dxa"/>
-              <w:left w:w="120" w:type="dxa"/>
-              <w:right w:w="120" w:type="dxa"/>
-            </w:tcMar>
-          </w:tcPr>
-          <w:p>
-            <w:pPr>
-              <w:spacing w:after="0"/>
-            </w:pPr>
-            <w:r>
-              <w:rPr>
-                <w:color w:val="1E293B"/>
-                <w:sz w:val="17"/>
-              </w:rPr>
-              <w:t>Lokal di MT5 (0 Token)</w:t>
-            </w:r>
-          </w:p>
-        </w:tc>
-      </w:tr>
-      <w:tr>
-        <w:tc>
-          <w:tcPr>
-            <w:tcW w:type="dxa" w:w="2880"/>
-            <w:shd w:fill="f8fafc"/>
-            <w:tcMar>
-              <w:top w:w="100" w:type="dxa"/>
-              <w:bottom w:w="100" w:type="dxa"/>
-              <w:left w:w="120" w:type="dxa"/>
-              <w:right w:w="120" w:type="dxa"/>
-            </w:tcMar>
-          </w:tcPr>
-          <w:p>
-            <w:pPr>
-              <w:spacing w:after="0"/>
-            </w:pPr>
-            <w:r>
-              <w:rPr>
-                <w:color w:val="1E293B"/>
-                <w:sz w:val="17"/>
-              </w:rPr>
-              <w:t>Panggilan API per Hari</w:t>
-            </w:r>
-          </w:p>
-        </w:tc>
-        <w:tc>
-          <w:tcPr>
-            <w:tcW w:type="dxa" w:w="2160"/>
-            <w:shd w:fill="f8fafc"/>
-            <w:tcMar>
-              <w:top w:w="100" w:type="dxa"/>
-              <w:bottom w:w="100" w:type="dxa"/>
-              <w:left w:w="120" w:type="dxa"/>
-              <w:right w:w="120" w:type="dxa"/>
-            </w:tcMar>
-          </w:tcPr>
-          <w:p>
-            <w:pPr>
-              <w:spacing w:after="0"/>
-            </w:pPr>
-            <w:r>
-              <w:rPr>
-                <w:color w:val="1E293B"/>
-                <w:sz w:val="17"/>
-              </w:rPr>
-              <w:t>23.328 API Calls / Hari</w:t>
-            </w:r>
-          </w:p>
-        </w:tc>
-        <w:tc>
-          <w:tcPr>
-            <w:tcW w:type="dxa" w:w="2304"/>
-            <w:shd w:fill="f8fafc"/>
-            <w:tcMar>
-              <w:top w:w="100" w:type="dxa"/>
-              <w:bottom w:w="100" w:type="dxa"/>
-              <w:left w:w="120" w:type="dxa"/>
-              <w:right w:w="120" w:type="dxa"/>
-            </w:tcMar>
-          </w:tcPr>
-          <w:p>
-            <w:pPr>
-              <w:spacing w:after="0"/>
-            </w:pPr>
-            <w:r>
-              <w:rPr>
-                <w:color w:val="1E293B"/>
-                <w:sz w:val="17"/>
-              </w:rPr>
-              <w:t>75 - 135 API Calls / Hari</w:t>
-            </w:r>
-          </w:p>
-        </w:tc>
-        <w:tc>
-          <w:tcPr>
-            <w:tcW w:type="dxa" w:w="2304"/>
-            <w:shd w:fill="f8fafc"/>
-            <w:tcMar>
-              <w:top w:w="100" w:type="dxa"/>
-              <w:bottom w:w="100" w:type="dxa"/>
-              <w:left w:w="120" w:type="dxa"/>
-              <w:right w:w="120" w:type="dxa"/>
-            </w:tcMar>
-          </w:tcPr>
-          <w:p>
-            <w:pPr>
-              <w:spacing w:after="0"/>
-            </w:pPr>
-            <w:r>
-              <w:rPr>
-                <w:color w:val="1E293B"/>
-                <w:sz w:val="17"/>
-              </w:rPr>
-              <w:t>Pangkas 99.4% Calls</w:t>
-            </w:r>
-          </w:p>
-        </w:tc>
-      </w:tr>
-      <w:tr>
-        <w:tc>
-          <w:tcPr>
-            <w:tcW w:type="dxa" w:w="2880"/>
-            <w:shd w:fill="ffffff"/>
-            <w:tcMar>
-              <w:top w:w="100" w:type="dxa"/>
-              <w:bottom w:w="100" w:type="dxa"/>
-              <w:left w:w="120" w:type="dxa"/>
-              <w:right w:w="120" w:type="dxa"/>
-            </w:tcMar>
-          </w:tcPr>
-          <w:p>
-            <w:pPr>
-              <w:spacing w:after="0"/>
-            </w:pPr>
-            <w:r>
-              <w:rPr>
-                <w:color w:val="1E293B"/>
-                <w:sz w:val="17"/>
-              </w:rPr>
-              <w:t>Konsumsi Token Harian</w:t>
-            </w:r>
-          </w:p>
-        </w:tc>
-        <w:tc>
-          <w:tcPr>
-            <w:tcW w:type="dxa" w:w="2160"/>
-            <w:shd w:fill="ffffff"/>
-            <w:tcMar>
-              <w:top w:w="100" w:type="dxa"/>
-              <w:bottom w:w="100" w:type="dxa"/>
-              <w:left w:w="120" w:type="dxa"/>
-              <w:right w:w="120" w:type="dxa"/>
-            </w:tcMar>
-          </w:tcPr>
-          <w:p>
-            <w:pPr>
-              <w:spacing w:after="0"/>
-            </w:pPr>
-            <w:r>
-              <w:rPr>
-                <w:color w:val="1E293B"/>
-                <w:sz w:val="17"/>
-              </w:rPr>
-              <w:t>~35.000.000 Token / Hari</w:t>
-            </w:r>
-          </w:p>
-        </w:tc>
-        <w:tc>
-          <w:tcPr>
-            <w:tcW w:type="dxa" w:w="2304"/>
-            <w:shd w:fill="ffffff"/>
-            <w:tcMar>
-              <w:top w:w="100" w:type="dxa"/>
-              <w:bottom w:w="100" w:type="dxa"/>
-              <w:left w:w="120" w:type="dxa"/>
-              <w:right w:w="120" w:type="dxa"/>
-            </w:tcMar>
-          </w:tcPr>
-          <w:p>
-            <w:pPr>
-              <w:spacing w:after="0"/>
-            </w:pPr>
-            <w:r>
-              <w:rPr>
-                <w:color w:val="1E293B"/>
-                <w:sz w:val="17"/>
-              </w:rPr>
-              <w:t>~150.000 Token / Hari</w:t>
-            </w:r>
-          </w:p>
-        </w:tc>
-        <w:tc>
-          <w:tcPr>
-            <w:tcW w:type="dxa" w:w="2304"/>
-            <w:shd w:fill="ffffff"/>
-            <w:tcMar>
-              <w:top w:w="100" w:type="dxa"/>
-              <w:bottom w:w="100" w:type="dxa"/>
-              <w:left w:w="120" w:type="dxa"/>
-              <w:right w:w="120" w:type="dxa"/>
-            </w:tcMar>
-          </w:tcPr>
-          <w:p>
-            <w:pPr>
-              <w:spacing w:after="0"/>
-            </w:pPr>
-            <w:r>
-              <w:rPr>
-                <w:color w:val="1E293B"/>
-                <w:sz w:val="17"/>
-              </w:rPr>
-              <w:t>Hemat 99.5% Token</w:t>
-            </w:r>
-          </w:p>
-        </w:tc>
-      </w:tr>
-      <w:tr>
-        <w:tc>
-          <w:tcPr>
-            <w:tcW w:type="dxa" w:w="2880"/>
-            <w:shd w:fill="f8fafc"/>
-            <w:tcMar>
-              <w:top w:w="100" w:type="dxa"/>
-              <w:bottom w:w="100" w:type="dxa"/>
-              <w:left w:w="120" w:type="dxa"/>
-              <w:right w:w="120" w:type="dxa"/>
-            </w:tcMar>
-          </w:tcPr>
-          <w:p>
-            <w:pPr>
-              <w:spacing w:after="0"/>
-            </w:pPr>
-            <w:r>
-              <w:rPr>
-                <w:color w:val="1E293B"/>
-                <w:sz w:val="17"/>
-              </w:rPr>
-              <w:t>Estimasi Biaya API Harian</w:t>
-            </w:r>
-          </w:p>
-        </w:tc>
-        <w:tc>
-          <w:tcPr>
-            <w:tcW w:type="dxa" w:w="2160"/>
-            <w:shd w:fill="f8fafc"/>
-            <w:tcMar>
-              <w:top w:w="100" w:type="dxa"/>
-              <w:bottom w:w="100" w:type="dxa"/>
-              <w:left w:w="120" w:type="dxa"/>
-              <w:right w:w="120" w:type="dxa"/>
-            </w:tcMar>
-          </w:tcPr>
-          <w:p>
-            <w:pPr>
-              <w:spacing w:after="0"/>
-            </w:pPr>
-            <w:r>
-              <w:rPr>
-                <w:color w:val="1E293B"/>
-                <w:sz w:val="17"/>
-              </w:rPr>
-              <w:t>$15.00 - $35.00 / Hari</w:t>
-            </w:r>
-          </w:p>
-        </w:tc>
-        <w:tc>
-          <w:tcPr>
-            <w:tcW w:type="dxa" w:w="2304"/>
-            <w:shd w:fill="f8fafc"/>
-            <w:tcMar>
-              <w:top w:w="100" w:type="dxa"/>
-              <w:bottom w:w="100" w:type="dxa"/>
-              <w:left w:w="120" w:type="dxa"/>
-              <w:right w:w="120" w:type="dxa"/>
-            </w:tcMar>
-          </w:tcPr>
-          <w:p>
-            <w:pPr>
-              <w:spacing w:after="0"/>
-            </w:pPr>
-            <w:r>
-              <w:rPr>
-                <w:color w:val="1E293B"/>
-                <w:sz w:val="17"/>
-              </w:rPr>
-              <w:t>$0.10 - $0.25 / Hari</w:t>
-            </w:r>
-          </w:p>
-        </w:tc>
-        <w:tc>
-          <w:tcPr>
-            <w:tcW w:type="dxa" w:w="2304"/>
-            <w:shd w:fill="f8fafc"/>
-            <w:tcMar>
-              <w:top w:w="100" w:type="dxa"/>
-              <w:bottom w:w="100" w:type="dxa"/>
-              <w:left w:w="120" w:type="dxa"/>
-              <w:right w:w="120" w:type="dxa"/>
-            </w:tcMar>
-          </w:tcPr>
-          <w:p>
-            <w:pPr>
-              <w:spacing w:after="0"/>
-            </w:pPr>
-            <w:r>
-              <w:rPr>
-                <w:color w:val="1E293B"/>
-                <w:sz w:val="17"/>
-              </w:rPr>
-              <w:t>Hemat Biaya ~99%</w:t>
-            </w:r>
-          </w:p>
-        </w:tc>
-      </w:tr>
-      <w:tr>
-        <w:tc>
-          <w:tcPr>
-            <w:tcW w:type="dxa" w:w="2880"/>
-            <w:shd w:fill="ffffff"/>
-            <w:tcMar>
-              <w:top w:w="100" w:type="dxa"/>
-              <w:bottom w:w="100" w:type="dxa"/>
-              <w:left w:w="120" w:type="dxa"/>
-              <w:right w:w="120" w:type="dxa"/>
-            </w:tcMar>
-          </w:tcPr>
-          <w:p>
-            <w:pPr>
-              <w:spacing w:after="0"/>
-            </w:pPr>
-            <w:r>
-              <w:rPr>
-                <w:color w:val="1E293B"/>
-                <w:sz w:val="17"/>
-              </w:rPr>
-              <w:t>Estimasi Biaya Bulanan</w:t>
-            </w:r>
-          </w:p>
-        </w:tc>
-        <w:tc>
-          <w:tcPr>
-            <w:tcW w:type="dxa" w:w="2160"/>
-            <w:shd w:fill="ffffff"/>
-            <w:tcMar>
-              <w:top w:w="100" w:type="dxa"/>
-              <w:bottom w:w="100" w:type="dxa"/>
-              <w:left w:w="120" w:type="dxa"/>
-              <w:right w:w="120" w:type="dxa"/>
-            </w:tcMar>
-          </w:tcPr>
-          <w:p>
-            <w:pPr>
-              <w:spacing w:after="0"/>
-            </w:pPr>
-            <w:r>
-              <w:rPr>
-                <w:color w:val="1E293B"/>
-                <w:sz w:val="17"/>
-              </w:rPr>
-              <w:t>$450 - $1.000 / Bulan</w:t>
-            </w:r>
-          </w:p>
-        </w:tc>
-        <w:tc>
-          <w:tcPr>
-            <w:tcW w:type="dxa" w:w="2304"/>
-            <w:shd w:fill="ffffff"/>
-            <w:tcMar>
-              <w:top w:w="100" w:type="dxa"/>
-              <w:bottom w:w="100" w:type="dxa"/>
-              <w:left w:w="120" w:type="dxa"/>
-              <w:right w:w="120" w:type="dxa"/>
-            </w:tcMar>
-          </w:tcPr>
-          <w:p>
-            <w:pPr>
-              <w:spacing w:after="0"/>
-            </w:pPr>
-            <w:r>
-              <w:rPr>
-                <w:color w:val="1E293B"/>
-                <w:sz w:val="17"/>
-              </w:rPr>
-              <w:t>$3.00 - $7.50 / Bulan</w:t>
-            </w:r>
-          </w:p>
-        </w:tc>
-        <w:tc>
-          <w:tcPr>
-            <w:tcW w:type="dxa" w:w="2304"/>
-            <w:shd w:fill="ffffff"/>
-            <w:tcMar>
-              <w:top w:w="100" w:type="dxa"/>
-              <w:bottom w:w="100" w:type="dxa"/>
-              <w:left w:w="120" w:type="dxa"/>
-              <w:right w:w="120" w:type="dxa"/>
-            </w:tcMar>
-          </w:tcPr>
-          <w:p>
-            <w:pPr>
-              <w:spacing w:after="0"/>
-            </w:pPr>
-            <w:r>
-              <w:rPr>
-                <w:color w:val="1E293B"/>
-                <w:sz w:val="17"/>
-              </w:rPr>
-              <w:t>Hemat $440+/Bulan</w:t>
-            </w:r>
-          </w:p>
-        </w:tc>
-      </w:tr>
-      <w:tr>
-        <w:tc>
-          <w:tcPr>
-            <w:tcW w:type="dxa" w:w="2880"/>
-            <w:shd w:fill="f8fafc"/>
-            <w:tcMar>
-              <w:top w:w="100" w:type="dxa"/>
-              <w:bottom w:w="100" w:type="dxa"/>
-              <w:left w:w="120" w:type="dxa"/>
-              <w:right w:w="120" w:type="dxa"/>
-            </w:tcMar>
-          </w:tcPr>
-          <w:p>
-            <w:pPr>
-              <w:spacing w:after="0"/>
-            </w:pPr>
-            <w:r>
-              <w:rPr>
-                <w:color w:val="1E293B"/>
-                <w:sz w:val="17"/>
-              </w:rPr>
-              <w:t>Risiko Error 429 Rate Limit</w:t>
-            </w:r>
-          </w:p>
-        </w:tc>
-        <w:tc>
-          <w:tcPr>
-            <w:tcW w:type="dxa" w:w="2160"/>
-            <w:shd w:fill="f8fafc"/>
-            <w:tcMar>
-              <w:top w:w="100" w:type="dxa"/>
-              <w:bottom w:w="100" w:type="dxa"/>
-              <w:left w:w="120" w:type="dxa"/>
-              <w:right w:w="120" w:type="dxa"/>
-            </w:tcMar>
-          </w:tcPr>
-          <w:p>
-            <w:pPr>
-              <w:spacing w:after="0"/>
-            </w:pPr>
-            <w:r>
-              <w:rPr>
-                <w:color w:val="1E293B"/>
-                <w:sz w:val="17"/>
-              </w:rPr>
-              <w:t>Sangat Tinggi (Sering Crash)</w:t>
-            </w:r>
-          </w:p>
-        </w:tc>
-        <w:tc>
-          <w:tcPr>
-            <w:tcW w:type="dxa" w:w="2304"/>
-            <w:shd w:fill="f8fafc"/>
-            <w:tcMar>
-              <w:top w:w="100" w:type="dxa"/>
-              <w:bottom w:w="100" w:type="dxa"/>
-              <w:left w:w="120" w:type="dxa"/>
-              <w:right w:w="120" w:type="dxa"/>
-            </w:tcMar>
-          </w:tcPr>
-          <w:p>
-            <w:pPr>
-              <w:spacing w:after="0"/>
-            </w:pPr>
-            <w:r>
-              <w:rPr>
-                <w:color w:val="1E293B"/>
-                <w:sz w:val="17"/>
-              </w:rPr>
-              <w:t>Nol Mutlak (Bebas Throttle)</w:t>
-            </w:r>
-          </w:p>
-        </w:tc>
-        <w:tc>
-          <w:tcPr>
-            <w:tcW w:type="dxa" w:w="2304"/>
-            <w:shd w:fill="f8fafc"/>
-            <w:tcMar>
-              <w:top w:w="100" w:type="dxa"/>
-              <w:bottom w:w="100" w:type="dxa"/>
-              <w:left w:w="120" w:type="dxa"/>
-              <w:right w:w="120" w:type="dxa"/>
-            </w:tcMar>
-          </w:tcPr>
-          <w:p>
-            <w:pPr>
-              <w:spacing w:after="0"/>
-            </w:pPr>
-            <w:r>
-              <w:rPr>
-                <w:color w:val="1E293B"/>
-                <w:sz w:val="17"/>
-              </w:rPr>
-              <w:t>Reliabilitas 100%</w:t>
-            </w:r>
-          </w:p>
-        </w:tc>
-      </w:tr>
-    </w:tbl>
-    <w:p>
-      <w:pPr>
-        <w:spacing w:after="120"/>
-      </w:pPr>
-    </w:p>
-    <w:p>
-      <w:pPr>
-        <w:pStyle w:val="Heading1"/>
-        <w:keepNext/>
-        <w:spacing w:before="360" w:after="120"/>
-      </w:pPr>
-      <w:r>
-        <w:rPr>
-          <w:b/>
-          <w:color w:val="0F172A"/>
-          <w:sz w:val="30"/>
-        </w:rPr>
-        <w:t>Bab 12: Telegram Interactive Controller &amp; Operational Playbook</w:t>
-      </w:r>
-    </w:p>
-    <w:p>
-      <w:r>
-        <w:t>Sistem dilengkapi antarmuka interaktif 2 arah melalui Telegram Bot dengan mode Fast POST polling:</w:t>
-      </w:r>
-    </w:p>
-    <w:p>
-      <w:r>
-        <w:t>• /status, /posisi, /scan, /news</w:t>
-        <w:br/>
-        <w:t>• /radar (Live Heat-Table 27 Simbol BUY/SELL)</w:t>
-        <w:br/>
-        <w:t>• /levels &lt;symbol&gt; (Peta Stasiun Atlas DNA)</w:t>
-        <w:br/>
-        <w:t>• /smc &lt;symbol&gt; (Peta Likuiditas Order Block &amp; FVG)</w:t>
-        <w:br/>
-        <w:t>• /macro &lt;symbol&gt; (Dossier 6-TF MSE SBR/RBS)</w:t>
-        <w:br/>
-        <w:t>• /analisa &lt;symbol&gt; (On-Demand 3-LLM Jury)</w:t>
-        <w:br/>
-        <w:t>• /closeall (Emergency Exit)</w:t>
-      </w:r>
     </w:p>
     <w:sectPr>
       <w:pgSz w:w="12240" w:h="15840"/>

</xml_diff>